<commit_message>
Apply owner corporate Excel and Word styles to both Microsoft projects
</commit_message>
<xml_diff>
--- a/projects/02_microsoft_dcf/deliverables/Microsoft_DCF_ReverseDCF_Report.docx
+++ b/projects/02_microsoft_dcf/deliverables/Microsoft_DCF_ReverseDCF_Report.docx
@@ -5,18 +5,40 @@
     <w:p>
       <w:pPr>
         <w:pStyle w:val="Title"/>
+        <w:jc w:val="center"/>
       </w:pPr>
       <w:r>
+        <w:rPr>
+          <w:rFonts w:ascii="Arial" w:hAnsi="Arial" w:eastAsia="Arial" w:cs="Arial"/>
+          <w:color w:val="000000"/>
+          <w:sz w:val="32"/>
+        </w:rPr>
         <w:t>Microsoft DCF and Reverse DCF</w:t>
       </w:r>
     </w:p>
     <w:p>
+      <w:pPr>
+        <w:jc w:val="left"/>
+      </w:pPr>
       <w:r>
+        <w:rPr>
+          <w:rFonts w:ascii="Arial" w:hAnsi="Arial" w:eastAsia="Arial" w:cs="Arial"/>
+          <w:color w:val="000000"/>
+          <w:sz w:val="18"/>
+        </w:rPr>
         <w:t>Portfolio project 02 | Goran Brkich</w:t>
       </w:r>
     </w:p>
     <w:p>
+      <w:pPr>
+        <w:jc w:val="left"/>
+      </w:pPr>
       <w:r>
+        <w:rPr>
+          <w:rFonts w:ascii="Arial" w:hAnsi="Arial" w:eastAsia="Arial" w:cs="Arial"/>
+          <w:color w:val="000000"/>
+          <w:sz w:val="18"/>
+        </w:rPr>
         <w:t>Valuation and information cutoff 8 October 2026</w:t>
         <w:br/>
         <w:t>Five explicit fiscal years FY2027 to FY2031</w:t>
@@ -27,18 +49,40 @@
     <w:p>
       <w:pPr>
         <w:pStyle w:val="Heading2"/>
+        <w:jc w:val="left"/>
       </w:pPr>
       <w:r>
+        <w:rPr>
+          <w:rFonts w:ascii="Arial" w:hAnsi="Arial" w:eastAsia="Arial" w:cs="Arial"/>
+          <w:color w:val="000000"/>
+          <w:sz w:val="18"/>
+        </w:rPr>
         <w:t>Valuation finding</w:t>
       </w:r>
     </w:p>
     <w:p>
+      <w:pPr>
+        <w:jc w:val="left"/>
+      </w:pPr>
       <w:r>
+        <w:rPr>
+          <w:rFonts w:ascii="Arial" w:hAnsi="Arial" w:eastAsia="Arial" w:cs="Arial"/>
+          <w:color w:val="000000"/>
+          <w:sz w:val="18"/>
+        </w:rPr>
         <w:t>The selected base assumptions produce a value of $286.35 per share against the observed close of $522.61. The conditional valuation is 45.2% below the close. Upside and downside fiscal cases produce $390.99 and $169.91. These differences measure the effects of the visible forecasts and valuation conventions.</w:t>
       </w:r>
     </w:p>
     <w:p>
+      <w:pPr>
+        <w:jc w:val="left"/>
+      </w:pPr>
       <w:r>
+        <w:rPr>
+          <w:rFonts w:ascii="Arial" w:hAnsi="Arial" w:eastAsia="Arial" w:cs="Arial"/>
+          <w:color w:val="000000"/>
+          <w:sz w:val="18"/>
+        </w:rPr>
         <w:drawing>
           <wp:inline xmlns:a="http://schemas.openxmlformats.org/drawingml/2006/main" xmlns:pic="http://schemas.openxmlformats.org/drawingml/2006/picture">
             <wp:extent cx="6217920" cy="2753650"/>
@@ -54,7 +98,9 @@
                     <pic:cNvPicPr/>
                   </pic:nvPicPr>
                   <pic:blipFill>
-                    <a:blip r:embed="rId10"/>
+                    <a:blip r:embed="rId10">
+                      <a:grayscl/>
+                    </a:blip>
                     <a:stretch>
                       <a:fillRect/>
                     </a:stretch>
@@ -76,41 +122,93 @@
     <w:p>
       <w:pPr>
         <w:pStyle w:val="Caption"/>
+        <w:jc w:val="left"/>
       </w:pPr>
       <w:r>
+        <w:rPr>
+          <w:rFonts w:ascii="Arial" w:hAnsi="Arial" w:eastAsia="Arial" w:cs="Arial"/>
+          <w:color w:val="000000"/>
+          <w:sz w:val="16"/>
+        </w:rPr>
         <w:t>Source Internal DCF calculations and preserved 8 October market observation</w:t>
       </w:r>
     </w:p>
     <w:p>
+      <w:pPr>
+        <w:jc w:val="left"/>
+      </w:pPr>
       <w:r>
+        <w:rPr>
+          <w:rFonts w:ascii="Arial" w:hAnsi="Arial" w:eastAsia="Arial" w:cs="Arial"/>
+          <w:color w:val="000000"/>
+          <w:sz w:val="18"/>
+        </w:rPr>
         <w:t>The base case discount rate is 9.81%, stable growth 3.0%, stable operating margin 40.0% and stable ROIC 20.0%. The stable period supplies 79.7% of enterprise value. The result is therefore particularly sensitive to long-run cash conversion and the required return.</w:t>
       </w:r>
     </w:p>
     <w:p>
+      <w:pPr>
+        <w:jc w:val="left"/>
+      </w:pPr>
       <w:r>
+        <w:rPr>
+          <w:rFonts w:ascii="Arial" w:hAnsi="Arial" w:eastAsia="Arial" w:cs="Arial"/>
+          <w:color w:val="000000"/>
+          <w:sz w:val="18"/>
+        </w:rPr>
         <w:t>The reverse analysis explains the market price through one criterion at a time. Revenue CAGR and lower WACC can solve it mathematically, while capex, working capital, tax and lease acquisition tests produce values outside reasonable operating bounds. No positive finite stable ROIC can explain the price alone under the base margins and growth.</w:t>
       </w:r>
     </w:p>
     <w:p>
+      <w:pPr>
+        <w:jc w:val="left"/>
+      </w:pPr>
       <w:r>
+        <w:rPr>
+          <w:rFonts w:ascii="Arial" w:hAnsi="Arial" w:eastAsia="Arial" w:cs="Arial"/>
+          <w:color w:val="000000"/>
+          <w:sz w:val="18"/>
+        </w:rPr>
         <w:br w:type="page"/>
       </w:r>
     </w:p>
     <w:p>
       <w:pPr>
         <w:pStyle w:val="Heading1"/>
+        <w:jc w:val="center"/>
       </w:pPr>
       <w:r>
+        <w:rPr>
+          <w:rFonts w:ascii="Arial" w:hAnsi="Arial" w:eastAsia="Arial" w:cs="Arial"/>
+          <w:color w:val="000000"/>
+          <w:sz w:val="21"/>
+        </w:rPr>
         <w:t>Operating forecast and investment</w:t>
       </w:r>
     </w:p>
     <w:p>
+      <w:pPr>
+        <w:jc w:val="left"/>
+      </w:pPr>
       <w:r>
+        <w:rPr>
+          <w:rFonts w:ascii="Arial" w:hAnsi="Arial" w:eastAsia="Arial" w:cs="Arial"/>
+          <w:color w:val="000000"/>
+          <w:sz w:val="18"/>
+        </w:rPr>
         <w:t>The annual forecast retains the project 03 fiscal scenario calibration for segment growth, operating margin, operating tax, D&amp;A, cash capital spending, capitalized interest, finance lease assets and operating working capital. The new DCF adds explicit discount timing and stable growth, margin and ROIC assumptions.</w:t>
       </w:r>
     </w:p>
     <w:p>
+      <w:pPr>
+        <w:jc w:val="left"/>
+      </w:pPr>
       <w:r>
+        <w:rPr>
+          <w:rFonts w:ascii="Arial" w:hAnsi="Arial" w:eastAsia="Arial" w:cs="Arial"/>
+          <w:color w:val="000000"/>
+          <w:sz w:val="18"/>
+        </w:rPr>
         <w:drawing>
           <wp:inline xmlns:a="http://schemas.openxmlformats.org/drawingml/2006/main" xmlns:pic="http://schemas.openxmlformats.org/drawingml/2006/picture">
             <wp:extent cx="6217920" cy="2842478"/>
@@ -126,7 +224,9 @@
                     <pic:cNvPicPr/>
                   </pic:nvPicPr>
                   <pic:blipFill>
-                    <a:blip r:embed="rId11"/>
+                    <a:blip r:embed="rId11">
+                      <a:grayscl/>
+                    </a:blip>
                     <a:stretch>
                       <a:fillRect/>
                     </a:stretch>
@@ -148,8 +248,14 @@
     <w:p>
       <w:pPr>
         <w:pStyle w:val="Caption"/>
+        <w:jc w:val="left"/>
       </w:pPr>
       <w:r>
+        <w:rPr>
+          <w:rFonts w:ascii="Arial" w:hAnsi="Arial" w:eastAsia="Arial" w:cs="Arial"/>
+          <w:color w:val="000000"/>
+          <w:sz w:val="16"/>
+        </w:rPr>
         <w:t>Full fiscal year amounts before the first year remaining cash flow adjustment</w:t>
       </w:r>
     </w:p>
@@ -159,6 +265,14 @@
         <w:jc w:val="center"/>
         <w:tblLayout w:type="fixed"/>
         <w:tblLook w:firstColumn="1" w:firstRow="1" w:lastColumn="0" w:lastRow="0" w:noHBand="0" w:noVBand="1" w:val="04A0"/>
+        <w:tblBorders>
+          <w:top w:val="single" w:sz="4" w:color="000000"/>
+          <w:bottom w:val="single" w:sz="4" w:color="000000"/>
+          <w:insideH w:val="nil" w:sz="4" w:color="000000"/>
+          <w:left w:val="nil"/>
+          <w:right w:val="nil"/>
+          <w:insideV w:val="nil"/>
+        </w:tblBorders>
       </w:tblPr>
       <w:tblGrid>
         <w:gridCol w:w="2448"/>
@@ -177,16 +291,22 @@
           <w:tcPr>
             <w:tcW w:type="dxa" w:w="2448"/>
             <w:vAlign w:val="center"/>
-            <w:shd w:fill="EAF0F7"/>
+            <w:shd w:fill="FFFFFF"/>
+            <w:tcBorders>
+              <w:bottom w:val="single" w:sz="4" w:color="000000"/>
+            </w:tcBorders>
           </w:tcPr>
           <w:p>
             <w:pPr>
-              <w:spacing w:after="80" w:before="80"/>
+              <w:spacing w:after="40" w:before="40"/>
+              <w:jc w:val="left"/>
             </w:pPr>
             <w:r>
               <w:rPr>
+                <w:rFonts w:ascii="Arial" w:hAnsi="Arial" w:eastAsia="Arial" w:cs="Arial"/>
                 <w:b/>
-                <w:sz w:val="18"/>
+                <w:color w:val="000000"/>
+                <w:sz w:val="16"/>
               </w:rPr>
               <w:t>USD billions</w:t>
             </w:r>
@@ -196,16 +316,22 @@
           <w:tcPr>
             <w:tcW w:type="dxa" w:w="1469"/>
             <w:vAlign w:val="center"/>
-            <w:shd w:fill="EAF0F7"/>
+            <w:shd w:fill="FFFFFF"/>
+            <w:tcBorders>
+              <w:bottom w:val="single" w:sz="4" w:color="000000"/>
+            </w:tcBorders>
           </w:tcPr>
           <w:p>
             <w:pPr>
-              <w:spacing w:after="80" w:before="80"/>
+              <w:spacing w:after="40" w:before="40"/>
+              <w:jc w:val="left"/>
             </w:pPr>
             <w:r>
               <w:rPr>
+                <w:rFonts w:ascii="Arial" w:hAnsi="Arial" w:eastAsia="Arial" w:cs="Arial"/>
                 <w:b/>
-                <w:sz w:val="18"/>
+                <w:color w:val="000000"/>
+                <w:sz w:val="16"/>
               </w:rPr>
               <w:t>FY2027</w:t>
             </w:r>
@@ -215,16 +341,22 @@
           <w:tcPr>
             <w:tcW w:type="dxa" w:w="1469"/>
             <w:vAlign w:val="center"/>
-            <w:shd w:fill="EAF0F7"/>
+            <w:shd w:fill="FFFFFF"/>
+            <w:tcBorders>
+              <w:bottom w:val="single" w:sz="4" w:color="000000"/>
+            </w:tcBorders>
           </w:tcPr>
           <w:p>
             <w:pPr>
-              <w:spacing w:after="80" w:before="80"/>
+              <w:spacing w:after="40" w:before="40"/>
+              <w:jc w:val="left"/>
             </w:pPr>
             <w:r>
               <w:rPr>
+                <w:rFonts w:ascii="Arial" w:hAnsi="Arial" w:eastAsia="Arial" w:cs="Arial"/>
                 <w:b/>
-                <w:sz w:val="18"/>
+                <w:color w:val="000000"/>
+                <w:sz w:val="16"/>
               </w:rPr>
               <w:t>FY2028</w:t>
             </w:r>
@@ -234,16 +366,22 @@
           <w:tcPr>
             <w:tcW w:type="dxa" w:w="1469"/>
             <w:vAlign w:val="center"/>
-            <w:shd w:fill="EAF0F7"/>
+            <w:shd w:fill="FFFFFF"/>
+            <w:tcBorders>
+              <w:bottom w:val="single" w:sz="4" w:color="000000"/>
+            </w:tcBorders>
           </w:tcPr>
           <w:p>
             <w:pPr>
-              <w:spacing w:after="80" w:before="80"/>
+              <w:spacing w:after="40" w:before="40"/>
+              <w:jc w:val="left"/>
             </w:pPr>
             <w:r>
               <w:rPr>
+                <w:rFonts w:ascii="Arial" w:hAnsi="Arial" w:eastAsia="Arial" w:cs="Arial"/>
                 <w:b/>
-                <w:sz w:val="18"/>
+                <w:color w:val="000000"/>
+                <w:sz w:val="16"/>
               </w:rPr>
               <w:t>FY2029</w:t>
             </w:r>
@@ -253,16 +391,22 @@
           <w:tcPr>
             <w:tcW w:type="dxa" w:w="1469"/>
             <w:vAlign w:val="center"/>
-            <w:shd w:fill="EAF0F7"/>
+            <w:shd w:fill="FFFFFF"/>
+            <w:tcBorders>
+              <w:bottom w:val="single" w:sz="4" w:color="000000"/>
+            </w:tcBorders>
           </w:tcPr>
           <w:p>
             <w:pPr>
-              <w:spacing w:after="80" w:before="80"/>
+              <w:spacing w:after="40" w:before="40"/>
+              <w:jc w:val="left"/>
             </w:pPr>
             <w:r>
               <w:rPr>
+                <w:rFonts w:ascii="Arial" w:hAnsi="Arial" w:eastAsia="Arial" w:cs="Arial"/>
                 <w:b/>
-                <w:sz w:val="18"/>
+                <w:color w:val="000000"/>
+                <w:sz w:val="16"/>
               </w:rPr>
               <w:t>FY2030</w:t>
             </w:r>
@@ -272,16 +416,22 @@
           <w:tcPr>
             <w:tcW w:type="dxa" w:w="1469"/>
             <w:vAlign w:val="center"/>
-            <w:shd w:fill="EAF0F7"/>
+            <w:shd w:fill="FFFFFF"/>
+            <w:tcBorders>
+              <w:bottom w:val="single" w:sz="4" w:color="000000"/>
+            </w:tcBorders>
           </w:tcPr>
           <w:p>
             <w:pPr>
-              <w:spacing w:after="80" w:before="80"/>
+              <w:spacing w:after="40" w:before="40"/>
+              <w:jc w:val="left"/>
             </w:pPr>
             <w:r>
               <w:rPr>
+                <w:rFonts w:ascii="Arial" w:hAnsi="Arial" w:eastAsia="Arial" w:cs="Arial"/>
                 <w:b/>
-                <w:sz w:val="18"/>
+                <w:color w:val="000000"/>
+                <w:sz w:val="16"/>
               </w:rPr>
               <w:t>FY2031</w:t>
             </w:r>
@@ -296,16 +446,19 @@
           <w:tcPr>
             <w:tcW w:type="dxa" w:w="2448"/>
             <w:vAlign w:val="center"/>
-            <w:shd w:fill="F6F8FA"/>
+            <w:shd w:fill="E5E5E5"/>
           </w:tcPr>
           <w:p>
             <w:pPr>
-              <w:spacing w:after="80" w:before="80"/>
+              <w:spacing w:after="40" w:before="40"/>
+              <w:jc w:val="left"/>
             </w:pPr>
             <w:r>
               <w:rPr>
+                <w:rFonts w:ascii="Arial" w:hAnsi="Arial" w:eastAsia="Arial" w:cs="Arial"/>
                 <w:b w:val="0"/>
-                <w:sz w:val="18"/>
+                <w:color w:val="000000"/>
+                <w:sz w:val="16"/>
               </w:rPr>
               <w:t>Revenue</w:t>
             </w:r>
@@ -315,16 +468,19 @@
           <w:tcPr>
             <w:tcW w:type="dxa" w:w="1469"/>
             <w:vAlign w:val="center"/>
-            <w:shd w:fill="F6F8FA"/>
+            <w:shd w:fill="E5E5E5"/>
           </w:tcPr>
           <w:p>
             <w:pPr>
-              <w:spacing w:after="80" w:before="80"/>
+              <w:spacing w:after="40" w:before="40"/>
+              <w:jc w:val="left"/>
             </w:pPr>
             <w:r>
               <w:rPr>
+                <w:rFonts w:ascii="Arial" w:hAnsi="Arial" w:eastAsia="Arial" w:cs="Arial"/>
                 <w:b w:val="0"/>
-                <w:sz w:val="18"/>
+                <w:color w:val="000000"/>
+                <w:sz w:val="16"/>
               </w:rPr>
               <w:t>385.0</w:t>
             </w:r>
@@ -334,16 +490,19 @@
           <w:tcPr>
             <w:tcW w:type="dxa" w:w="1469"/>
             <w:vAlign w:val="center"/>
-            <w:shd w:fill="F6F8FA"/>
+            <w:shd w:fill="E5E5E5"/>
           </w:tcPr>
           <w:p>
             <w:pPr>
-              <w:spacing w:after="80" w:before="80"/>
+              <w:spacing w:after="40" w:before="40"/>
+              <w:jc w:val="left"/>
             </w:pPr>
             <w:r>
               <w:rPr>
+                <w:rFonts w:ascii="Arial" w:hAnsi="Arial" w:eastAsia="Arial" w:cs="Arial"/>
                 <w:b w:val="0"/>
-                <w:sz w:val="18"/>
+                <w:color w:val="000000"/>
+                <w:sz w:val="16"/>
               </w:rPr>
               <w:t>444.5</w:t>
             </w:r>
@@ -353,16 +512,19 @@
           <w:tcPr>
             <w:tcW w:type="dxa" w:w="1469"/>
             <w:vAlign w:val="center"/>
-            <w:shd w:fill="F6F8FA"/>
+            <w:shd w:fill="E5E5E5"/>
           </w:tcPr>
           <w:p>
             <w:pPr>
-              <w:spacing w:after="80" w:before="80"/>
+              <w:spacing w:after="40" w:before="40"/>
+              <w:jc w:val="left"/>
             </w:pPr>
             <w:r>
               <w:rPr>
+                <w:rFonts w:ascii="Arial" w:hAnsi="Arial" w:eastAsia="Arial" w:cs="Arial"/>
                 <w:b w:val="0"/>
-                <w:sz w:val="18"/>
+                <w:color w:val="000000"/>
+                <w:sz w:val="16"/>
               </w:rPr>
               <w:t>508.9</w:t>
             </w:r>
@@ -372,16 +534,19 @@
           <w:tcPr>
             <w:tcW w:type="dxa" w:w="1469"/>
             <w:vAlign w:val="center"/>
-            <w:shd w:fill="F6F8FA"/>
+            <w:shd w:fill="E5E5E5"/>
           </w:tcPr>
           <w:p>
             <w:pPr>
-              <w:spacing w:after="80" w:before="80"/>
+              <w:spacing w:after="40" w:before="40"/>
+              <w:jc w:val="left"/>
             </w:pPr>
             <w:r>
               <w:rPr>
+                <w:rFonts w:ascii="Arial" w:hAnsi="Arial" w:eastAsia="Arial" w:cs="Arial"/>
                 <w:b w:val="0"/>
-                <w:sz w:val="18"/>
+                <w:color w:val="000000"/>
+                <w:sz w:val="16"/>
               </w:rPr>
               <w:t>577.3</w:t>
             </w:r>
@@ -391,16 +556,19 @@
           <w:tcPr>
             <w:tcW w:type="dxa" w:w="1469"/>
             <w:vAlign w:val="center"/>
-            <w:shd w:fill="F6F8FA"/>
+            <w:shd w:fill="E5E5E5"/>
           </w:tcPr>
           <w:p>
             <w:pPr>
-              <w:spacing w:after="80" w:before="80"/>
+              <w:spacing w:after="40" w:before="40"/>
+              <w:jc w:val="left"/>
             </w:pPr>
             <w:r>
               <w:rPr>
+                <w:rFonts w:ascii="Arial" w:hAnsi="Arial" w:eastAsia="Arial" w:cs="Arial"/>
                 <w:b w:val="0"/>
-                <w:sz w:val="18"/>
+                <w:color w:val="000000"/>
+                <w:sz w:val="16"/>
               </w:rPr>
               <w:t>648.1</w:t>
             </w:r>
@@ -419,12 +587,15 @@
           </w:tcPr>
           <w:p>
             <w:pPr>
-              <w:spacing w:after="80" w:before="80"/>
+              <w:spacing w:after="40" w:before="40"/>
+              <w:jc w:val="left"/>
             </w:pPr>
             <w:r>
               <w:rPr>
+                <w:rFonts w:ascii="Arial" w:hAnsi="Arial" w:eastAsia="Arial" w:cs="Arial"/>
                 <w:b w:val="0"/>
-                <w:sz w:val="18"/>
+                <w:color w:val="000000"/>
+                <w:sz w:val="16"/>
               </w:rPr>
               <w:t>Operating profit</w:t>
             </w:r>
@@ -438,12 +609,15 @@
           </w:tcPr>
           <w:p>
             <w:pPr>
-              <w:spacing w:after="80" w:before="80"/>
+              <w:spacing w:after="40" w:before="40"/>
+              <w:jc w:val="left"/>
             </w:pPr>
             <w:r>
               <w:rPr>
+                <w:rFonts w:ascii="Arial" w:hAnsi="Arial" w:eastAsia="Arial" w:cs="Arial"/>
                 <w:b w:val="0"/>
-                <w:sz w:val="18"/>
+                <w:color w:val="000000"/>
+                <w:sz w:val="16"/>
               </w:rPr>
               <w:t>175.7</w:t>
             </w:r>
@@ -457,12 +631,15 @@
           </w:tcPr>
           <w:p>
             <w:pPr>
-              <w:spacing w:after="80" w:before="80"/>
+              <w:spacing w:after="40" w:before="40"/>
+              <w:jc w:val="left"/>
             </w:pPr>
             <w:r>
               <w:rPr>
+                <w:rFonts w:ascii="Arial" w:hAnsi="Arial" w:eastAsia="Arial" w:cs="Arial"/>
                 <w:b w:val="0"/>
-                <w:sz w:val="18"/>
+                <w:color w:val="000000"/>
+                <w:sz w:val="16"/>
               </w:rPr>
               <w:t>189.2</w:t>
             </w:r>
@@ -476,12 +653,15 @@
           </w:tcPr>
           <w:p>
             <w:pPr>
-              <w:spacing w:after="80" w:before="80"/>
+              <w:spacing w:after="40" w:before="40"/>
+              <w:jc w:val="left"/>
             </w:pPr>
             <w:r>
               <w:rPr>
+                <w:rFonts w:ascii="Arial" w:hAnsi="Arial" w:eastAsia="Arial" w:cs="Arial"/>
                 <w:b w:val="0"/>
-                <w:sz w:val="18"/>
+                <w:color w:val="000000"/>
+                <w:sz w:val="16"/>
               </w:rPr>
               <w:t>204.7</w:t>
             </w:r>
@@ -495,12 +675,15 @@
           </w:tcPr>
           <w:p>
             <w:pPr>
-              <w:spacing w:after="80" w:before="80"/>
+              <w:spacing w:after="40" w:before="40"/>
+              <w:jc w:val="left"/>
             </w:pPr>
             <w:r>
               <w:rPr>
+                <w:rFonts w:ascii="Arial" w:hAnsi="Arial" w:eastAsia="Arial" w:cs="Arial"/>
                 <w:b w:val="0"/>
-                <w:sz w:val="18"/>
+                <w:color w:val="000000"/>
+                <w:sz w:val="16"/>
               </w:rPr>
               <w:t>223.0</w:t>
             </w:r>
@@ -514,12 +697,15 @@
           </w:tcPr>
           <w:p>
             <w:pPr>
-              <w:spacing w:after="80" w:before="80"/>
+              <w:spacing w:after="40" w:before="40"/>
+              <w:jc w:val="left"/>
             </w:pPr>
             <w:r>
               <w:rPr>
+                <w:rFonts w:ascii="Arial" w:hAnsi="Arial" w:eastAsia="Arial" w:cs="Arial"/>
                 <w:b w:val="0"/>
-                <w:sz w:val="18"/>
+                <w:color w:val="000000"/>
+                <w:sz w:val="16"/>
               </w:rPr>
               <w:t>242.8</w:t>
             </w:r>
@@ -534,16 +720,19 @@
           <w:tcPr>
             <w:tcW w:type="dxa" w:w="2448"/>
             <w:vAlign w:val="center"/>
-            <w:shd w:fill="F6F8FA"/>
+            <w:shd w:fill="E5E5E5"/>
           </w:tcPr>
           <w:p>
             <w:pPr>
-              <w:spacing w:after="80" w:before="80"/>
+              <w:spacing w:after="40" w:before="40"/>
+              <w:jc w:val="left"/>
             </w:pPr>
             <w:r>
               <w:rPr>
+                <w:rFonts w:ascii="Arial" w:hAnsi="Arial" w:eastAsia="Arial" w:cs="Arial"/>
                 <w:b w:val="0"/>
-                <w:sz w:val="18"/>
+                <w:color w:val="000000"/>
+                <w:sz w:val="16"/>
               </w:rPr>
               <w:t>NOPAT</w:t>
             </w:r>
@@ -553,16 +742,19 @@
           <w:tcPr>
             <w:tcW w:type="dxa" w:w="1469"/>
             <w:vAlign w:val="center"/>
-            <w:shd w:fill="F6F8FA"/>
+            <w:shd w:fill="E5E5E5"/>
           </w:tcPr>
           <w:p>
             <w:pPr>
-              <w:spacing w:after="80" w:before="80"/>
+              <w:spacing w:after="40" w:before="40"/>
+              <w:jc w:val="left"/>
             </w:pPr>
             <w:r>
               <w:rPr>
+                <w:rFonts w:ascii="Arial" w:hAnsi="Arial" w:eastAsia="Arial" w:cs="Arial"/>
                 <w:b w:val="0"/>
-                <w:sz w:val="18"/>
+                <w:color w:val="000000"/>
+                <w:sz w:val="16"/>
               </w:rPr>
               <w:t>140.6</w:t>
             </w:r>
@@ -572,16 +764,19 @@
           <w:tcPr>
             <w:tcW w:type="dxa" w:w="1469"/>
             <w:vAlign w:val="center"/>
-            <w:shd w:fill="F6F8FA"/>
+            <w:shd w:fill="E5E5E5"/>
           </w:tcPr>
           <w:p>
             <w:pPr>
-              <w:spacing w:after="80" w:before="80"/>
+              <w:spacing w:after="40" w:before="40"/>
+              <w:jc w:val="left"/>
             </w:pPr>
             <w:r>
               <w:rPr>
+                <w:rFonts w:ascii="Arial" w:hAnsi="Arial" w:eastAsia="Arial" w:cs="Arial"/>
                 <w:b w:val="0"/>
-                <w:sz w:val="18"/>
+                <w:color w:val="000000"/>
+                <w:sz w:val="16"/>
               </w:rPr>
               <w:t>151.3</w:t>
             </w:r>
@@ -591,16 +786,19 @@
           <w:tcPr>
             <w:tcW w:type="dxa" w:w="1469"/>
             <w:vAlign w:val="center"/>
-            <w:shd w:fill="F6F8FA"/>
+            <w:shd w:fill="E5E5E5"/>
           </w:tcPr>
           <w:p>
             <w:pPr>
-              <w:spacing w:after="80" w:before="80"/>
+              <w:spacing w:after="40" w:before="40"/>
+              <w:jc w:val="left"/>
             </w:pPr>
             <w:r>
               <w:rPr>
+                <w:rFonts w:ascii="Arial" w:hAnsi="Arial" w:eastAsia="Arial" w:cs="Arial"/>
                 <w:b w:val="0"/>
-                <w:sz w:val="18"/>
+                <w:color w:val="000000"/>
+                <w:sz w:val="16"/>
               </w:rPr>
               <w:t>163.8</w:t>
             </w:r>
@@ -610,16 +808,19 @@
           <w:tcPr>
             <w:tcW w:type="dxa" w:w="1469"/>
             <w:vAlign w:val="center"/>
-            <w:shd w:fill="F6F8FA"/>
+            <w:shd w:fill="E5E5E5"/>
           </w:tcPr>
           <w:p>
             <w:pPr>
-              <w:spacing w:after="80" w:before="80"/>
+              <w:spacing w:after="40" w:before="40"/>
+              <w:jc w:val="left"/>
             </w:pPr>
             <w:r>
               <w:rPr>
+                <w:rFonts w:ascii="Arial" w:hAnsi="Arial" w:eastAsia="Arial" w:cs="Arial"/>
                 <w:b w:val="0"/>
-                <w:sz w:val="18"/>
+                <w:color w:val="000000"/>
+                <w:sz w:val="16"/>
               </w:rPr>
               <w:t>178.4</w:t>
             </w:r>
@@ -629,16 +830,19 @@
           <w:tcPr>
             <w:tcW w:type="dxa" w:w="1469"/>
             <w:vAlign w:val="center"/>
-            <w:shd w:fill="F6F8FA"/>
+            <w:shd w:fill="E5E5E5"/>
           </w:tcPr>
           <w:p>
             <w:pPr>
-              <w:spacing w:after="80" w:before="80"/>
+              <w:spacing w:after="40" w:before="40"/>
+              <w:jc w:val="left"/>
             </w:pPr>
             <w:r>
               <w:rPr>
+                <w:rFonts w:ascii="Arial" w:hAnsi="Arial" w:eastAsia="Arial" w:cs="Arial"/>
                 <w:b w:val="0"/>
-                <w:sz w:val="18"/>
+                <w:color w:val="000000"/>
+                <w:sz w:val="16"/>
               </w:rPr>
               <w:t>194.2</w:t>
             </w:r>
@@ -657,12 +861,15 @@
           </w:tcPr>
           <w:p>
             <w:pPr>
-              <w:spacing w:after="80" w:before="80"/>
+              <w:spacing w:after="40" w:before="40"/>
+              <w:jc w:val="left"/>
             </w:pPr>
             <w:r>
               <w:rPr>
+                <w:rFonts w:ascii="Arial" w:hAnsi="Arial" w:eastAsia="Arial" w:cs="Arial"/>
                 <w:b w:val="0"/>
-                <w:sz w:val="18"/>
+                <w:color w:val="000000"/>
+                <w:sz w:val="16"/>
               </w:rPr>
               <w:t>Economic capex</w:t>
             </w:r>
@@ -676,12 +883,15 @@
           </w:tcPr>
           <w:p>
             <w:pPr>
-              <w:spacing w:after="80" w:before="80"/>
+              <w:spacing w:after="40" w:before="40"/>
+              <w:jc w:val="left"/>
             </w:pPr>
             <w:r>
               <w:rPr>
+                <w:rFonts w:ascii="Arial" w:hAnsi="Arial" w:eastAsia="Arial" w:cs="Arial"/>
                 <w:b w:val="0"/>
-                <w:sz w:val="18"/>
+                <w:color w:val="000000"/>
+                <w:sz w:val="16"/>
               </w:rPr>
               <w:t>151.0</w:t>
             </w:r>
@@ -695,12 +905,15 @@
           </w:tcPr>
           <w:p>
             <w:pPr>
-              <w:spacing w:after="80" w:before="80"/>
+              <w:spacing w:after="40" w:before="40"/>
+              <w:jc w:val="left"/>
             </w:pPr>
             <w:r>
               <w:rPr>
+                <w:rFonts w:ascii="Arial" w:hAnsi="Arial" w:eastAsia="Arial" w:cs="Arial"/>
                 <w:b w:val="0"/>
-                <w:sz w:val="18"/>
+                <w:color w:val="000000"/>
+                <w:sz w:val="16"/>
               </w:rPr>
               <w:t>154.4</w:t>
             </w:r>
@@ -714,12 +927,15 @@
           </w:tcPr>
           <w:p>
             <w:pPr>
-              <w:spacing w:after="80" w:before="80"/>
+              <w:spacing w:after="40" w:before="40"/>
+              <w:jc w:val="left"/>
             </w:pPr>
             <w:r>
               <w:rPr>
+                <w:rFonts w:ascii="Arial" w:hAnsi="Arial" w:eastAsia="Arial" w:cs="Arial"/>
                 <w:b w:val="0"/>
-                <w:sz w:val="18"/>
+                <w:color w:val="000000"/>
+                <w:sz w:val="16"/>
               </w:rPr>
               <w:t>158.9</w:t>
             </w:r>
@@ -733,12 +949,15 @@
           </w:tcPr>
           <w:p>
             <w:pPr>
-              <w:spacing w:after="80" w:before="80"/>
+              <w:spacing w:after="40" w:before="40"/>
+              <w:jc w:val="left"/>
             </w:pPr>
             <w:r>
               <w:rPr>
+                <w:rFonts w:ascii="Arial" w:hAnsi="Arial" w:eastAsia="Arial" w:cs="Arial"/>
                 <w:b w:val="0"/>
-                <w:sz w:val="18"/>
+                <w:color w:val="000000"/>
+                <w:sz w:val="16"/>
               </w:rPr>
               <w:t>160.0</w:t>
             </w:r>
@@ -752,12 +971,15 @@
           </w:tcPr>
           <w:p>
             <w:pPr>
-              <w:spacing w:after="80" w:before="80"/>
+              <w:spacing w:after="40" w:before="40"/>
+              <w:jc w:val="left"/>
             </w:pPr>
             <w:r>
               <w:rPr>
+                <w:rFonts w:ascii="Arial" w:hAnsi="Arial" w:eastAsia="Arial" w:cs="Arial"/>
                 <w:b w:val="0"/>
-                <w:sz w:val="18"/>
+                <w:color w:val="000000"/>
+                <w:sz w:val="16"/>
               </w:rPr>
               <w:t>163.4</w:t>
             </w:r>
@@ -772,16 +994,19 @@
           <w:tcPr>
             <w:tcW w:type="dxa" w:w="2448"/>
             <w:vAlign w:val="center"/>
-            <w:shd w:fill="F6F8FA"/>
+            <w:shd w:fill="E5E5E5"/>
           </w:tcPr>
           <w:p>
             <w:pPr>
-              <w:spacing w:after="80" w:before="80"/>
+              <w:spacing w:after="40" w:before="40"/>
+              <w:jc w:val="left"/>
             </w:pPr>
             <w:r>
               <w:rPr>
+                <w:rFonts w:ascii="Arial" w:hAnsi="Arial" w:eastAsia="Arial" w:cs="Arial"/>
                 <w:b w:val="0"/>
-                <w:sz w:val="18"/>
+                <w:color w:val="000000"/>
+                <w:sz w:val="16"/>
               </w:rPr>
               <w:t>D&amp;A</w:t>
             </w:r>
@@ -791,16 +1016,19 @@
           <w:tcPr>
             <w:tcW w:type="dxa" w:w="1469"/>
             <w:vAlign w:val="center"/>
-            <w:shd w:fill="F6F8FA"/>
+            <w:shd w:fill="E5E5E5"/>
           </w:tcPr>
           <w:p>
             <w:pPr>
-              <w:spacing w:after="80" w:before="80"/>
+              <w:spacing w:after="40" w:before="40"/>
+              <w:jc w:val="left"/>
             </w:pPr>
             <w:r>
               <w:rPr>
+                <w:rFonts w:ascii="Arial" w:hAnsi="Arial" w:eastAsia="Arial" w:cs="Arial"/>
                 <w:b w:val="0"/>
-                <w:sz w:val="18"/>
+                <w:color w:val="000000"/>
+                <w:sz w:val="16"/>
               </w:rPr>
               <w:t>53.4</w:t>
             </w:r>
@@ -810,16 +1038,19 @@
           <w:tcPr>
             <w:tcW w:type="dxa" w:w="1469"/>
             <w:vAlign w:val="center"/>
-            <w:shd w:fill="F6F8FA"/>
+            <w:shd w:fill="E5E5E5"/>
           </w:tcPr>
           <w:p>
             <w:pPr>
-              <w:spacing w:after="80" w:before="80"/>
+              <w:spacing w:after="40" w:before="40"/>
+              <w:jc w:val="left"/>
             </w:pPr>
             <w:r>
               <w:rPr>
+                <w:rFonts w:ascii="Arial" w:hAnsi="Arial" w:eastAsia="Arial" w:cs="Arial"/>
                 <w:b w:val="0"/>
-                <w:sz w:val="18"/>
+                <w:color w:val="000000"/>
+                <w:sz w:val="16"/>
               </w:rPr>
               <w:t>77.7</w:t>
             </w:r>
@@ -829,16 +1060,19 @@
           <w:tcPr>
             <w:tcW w:type="dxa" w:w="1469"/>
             <w:vAlign w:val="center"/>
-            <w:shd w:fill="F6F8FA"/>
+            <w:shd w:fill="E5E5E5"/>
           </w:tcPr>
           <w:p>
             <w:pPr>
-              <w:spacing w:after="80" w:before="80"/>
+              <w:spacing w:after="40" w:before="40"/>
+              <w:jc w:val="left"/>
             </w:pPr>
             <w:r>
               <w:rPr>
+                <w:rFonts w:ascii="Arial" w:hAnsi="Arial" w:eastAsia="Arial" w:cs="Arial"/>
                 <w:b w:val="0"/>
-                <w:sz w:val="18"/>
+                <w:color w:val="000000"/>
+                <w:sz w:val="16"/>
               </w:rPr>
               <w:t>103.5</w:t>
             </w:r>
@@ -848,16 +1082,19 @@
           <w:tcPr>
             <w:tcW w:type="dxa" w:w="1469"/>
             <w:vAlign w:val="center"/>
-            <w:shd w:fill="F6F8FA"/>
+            <w:shd w:fill="E5E5E5"/>
           </w:tcPr>
           <w:p>
             <w:pPr>
-              <w:spacing w:after="80" w:before="80"/>
+              <w:spacing w:after="40" w:before="40"/>
+              <w:jc w:val="left"/>
             </w:pPr>
             <w:r>
               <w:rPr>
+                <w:rFonts w:ascii="Arial" w:hAnsi="Arial" w:eastAsia="Arial" w:cs="Arial"/>
                 <w:b w:val="0"/>
-                <w:sz w:val="18"/>
+                <w:color w:val="000000"/>
+                <w:sz w:val="16"/>
               </w:rPr>
               <w:t>129.5</w:t>
             </w:r>
@@ -867,16 +1104,19 @@
           <w:tcPr>
             <w:tcW w:type="dxa" w:w="1469"/>
             <w:vAlign w:val="center"/>
-            <w:shd w:fill="F6F8FA"/>
+            <w:shd w:fill="E5E5E5"/>
           </w:tcPr>
           <w:p>
             <w:pPr>
-              <w:spacing w:after="80" w:before="80"/>
+              <w:spacing w:after="40" w:before="40"/>
+              <w:jc w:val="left"/>
             </w:pPr>
             <w:r>
               <w:rPr>
+                <w:rFonts w:ascii="Arial" w:hAnsi="Arial" w:eastAsia="Arial" w:cs="Arial"/>
                 <w:b w:val="0"/>
-                <w:sz w:val="18"/>
+                <w:color w:val="000000"/>
+                <w:sz w:val="16"/>
               </w:rPr>
               <w:t>156.0</w:t>
             </w:r>
@@ -895,12 +1135,15 @@
           </w:tcPr>
           <w:p>
             <w:pPr>
-              <w:spacing w:after="80" w:before="80"/>
+              <w:spacing w:after="40" w:before="40"/>
+              <w:jc w:val="left"/>
             </w:pPr>
             <w:r>
               <w:rPr>
+                <w:rFonts w:ascii="Arial" w:hAnsi="Arial" w:eastAsia="Arial" w:cs="Arial"/>
                 <w:b w:val="0"/>
-                <w:sz w:val="18"/>
+                <w:color w:val="000000"/>
+                <w:sz w:val="16"/>
               </w:rPr>
               <w:t>Change in NWC</w:t>
             </w:r>
@@ -914,12 +1157,15 @@
           </w:tcPr>
           <w:p>
             <w:pPr>
-              <w:spacing w:after="80" w:before="80"/>
+              <w:spacing w:after="40" w:before="40"/>
+              <w:jc w:val="left"/>
             </w:pPr>
             <w:r>
               <w:rPr>
+                <w:rFonts w:ascii="Arial" w:hAnsi="Arial" w:eastAsia="Arial" w:cs="Arial"/>
                 <w:b w:val="0"/>
-                <w:sz w:val="18"/>
+                <w:color w:val="000000"/>
+                <w:sz w:val="16"/>
               </w:rPr>
               <w:t>-3.2</w:t>
             </w:r>
@@ -933,12 +1179,15 @@
           </w:tcPr>
           <w:p>
             <w:pPr>
-              <w:spacing w:after="80" w:before="80"/>
+              <w:spacing w:after="40" w:before="40"/>
+              <w:jc w:val="left"/>
             </w:pPr>
             <w:r>
               <w:rPr>
+                <w:rFonts w:ascii="Arial" w:hAnsi="Arial" w:eastAsia="Arial" w:cs="Arial"/>
                 <w:b w:val="0"/>
-                <w:sz w:val="18"/>
+                <w:color w:val="000000"/>
+                <w:sz w:val="16"/>
               </w:rPr>
               <w:t>-5.0</w:t>
             </w:r>
@@ -952,12 +1201,15 @@
           </w:tcPr>
           <w:p>
             <w:pPr>
-              <w:spacing w:after="80" w:before="80"/>
+              <w:spacing w:after="40" w:before="40"/>
+              <w:jc w:val="left"/>
             </w:pPr>
             <w:r>
               <w:rPr>
+                <w:rFonts w:ascii="Arial" w:hAnsi="Arial" w:eastAsia="Arial" w:cs="Arial"/>
                 <w:b w:val="0"/>
-                <w:sz w:val="18"/>
+                <w:color w:val="000000"/>
+                <w:sz w:val="16"/>
               </w:rPr>
               <w:t>-3.7</w:t>
             </w:r>
@@ -971,12 +1223,15 @@
           </w:tcPr>
           <w:p>
             <w:pPr>
-              <w:spacing w:after="80" w:before="80"/>
+              <w:spacing w:after="40" w:before="40"/>
+              <w:jc w:val="left"/>
             </w:pPr>
             <w:r>
               <w:rPr>
+                <w:rFonts w:ascii="Arial" w:hAnsi="Arial" w:eastAsia="Arial" w:cs="Arial"/>
                 <w:b w:val="0"/>
-                <w:sz w:val="18"/>
+                <w:color w:val="000000"/>
+                <w:sz w:val="16"/>
               </w:rPr>
               <w:t>-4.3</w:t>
             </w:r>
@@ -990,12 +1245,15 @@
           </w:tcPr>
           <w:p>
             <w:pPr>
-              <w:spacing w:after="80" w:before="80"/>
+              <w:spacing w:after="40" w:before="40"/>
+              <w:jc w:val="left"/>
             </w:pPr>
             <w:r>
               <w:rPr>
+                <w:rFonts w:ascii="Arial" w:hAnsi="Arial" w:eastAsia="Arial" w:cs="Arial"/>
                 <w:b w:val="0"/>
-                <w:sz w:val="18"/>
+                <w:color w:val="000000"/>
+                <w:sz w:val="16"/>
               </w:rPr>
               <w:t>-5.0</w:t>
             </w:r>
@@ -1010,16 +1268,19 @@
           <w:tcPr>
             <w:tcW w:type="dxa" w:w="2448"/>
             <w:vAlign w:val="center"/>
-            <w:shd w:fill="F6F8FA"/>
+            <w:shd w:fill="E5E5E5"/>
           </w:tcPr>
           <w:p>
             <w:pPr>
-              <w:spacing w:after="80" w:before="80"/>
+              <w:spacing w:after="40" w:before="40"/>
+              <w:jc w:val="left"/>
             </w:pPr>
             <w:r>
               <w:rPr>
+                <w:rFonts w:ascii="Arial" w:hAnsi="Arial" w:eastAsia="Arial" w:cs="Arial"/>
                 <w:b w:val="0"/>
-                <w:sz w:val="18"/>
+                <w:color w:val="000000"/>
+                <w:sz w:val="16"/>
               </w:rPr>
               <w:t>Unlevered FCF</w:t>
             </w:r>
@@ -1029,16 +1290,19 @@
           <w:tcPr>
             <w:tcW w:type="dxa" w:w="1469"/>
             <w:vAlign w:val="center"/>
-            <w:shd w:fill="F6F8FA"/>
+            <w:shd w:fill="E5E5E5"/>
           </w:tcPr>
           <w:p>
             <w:pPr>
-              <w:spacing w:after="80" w:before="80"/>
+              <w:spacing w:after="40" w:before="40"/>
+              <w:jc w:val="left"/>
             </w:pPr>
             <w:r>
               <w:rPr>
+                <w:rFonts w:ascii="Arial" w:hAnsi="Arial" w:eastAsia="Arial" w:cs="Arial"/>
                 <w:b w:val="0"/>
-                <w:sz w:val="18"/>
+                <w:color w:val="000000"/>
+                <w:sz w:val="16"/>
               </w:rPr>
               <w:t>46.2</w:t>
             </w:r>
@@ -1048,16 +1312,19 @@
           <w:tcPr>
             <w:tcW w:type="dxa" w:w="1469"/>
             <w:vAlign w:val="center"/>
-            <w:shd w:fill="F6F8FA"/>
+            <w:shd w:fill="E5E5E5"/>
           </w:tcPr>
           <w:p>
             <w:pPr>
-              <w:spacing w:after="80" w:before="80"/>
+              <w:spacing w:after="40" w:before="40"/>
+              <w:jc w:val="left"/>
             </w:pPr>
             <w:r>
               <w:rPr>
+                <w:rFonts w:ascii="Arial" w:hAnsi="Arial" w:eastAsia="Arial" w:cs="Arial"/>
                 <w:b w:val="0"/>
-                <w:sz w:val="18"/>
+                <w:color w:val="000000"/>
+                <w:sz w:val="16"/>
               </w:rPr>
               <w:t>79.7</w:t>
             </w:r>
@@ -1067,16 +1334,19 @@
           <w:tcPr>
             <w:tcW w:type="dxa" w:w="1469"/>
             <w:vAlign w:val="center"/>
-            <w:shd w:fill="F6F8FA"/>
+            <w:shd w:fill="E5E5E5"/>
           </w:tcPr>
           <w:p>
             <w:pPr>
-              <w:spacing w:after="80" w:before="80"/>
+              <w:spacing w:after="40" w:before="40"/>
+              <w:jc w:val="left"/>
             </w:pPr>
             <w:r>
               <w:rPr>
+                <w:rFonts w:ascii="Arial" w:hAnsi="Arial" w:eastAsia="Arial" w:cs="Arial"/>
                 <w:b w:val="0"/>
-                <w:sz w:val="18"/>
+                <w:color w:val="000000"/>
+                <w:sz w:val="16"/>
               </w:rPr>
               <w:t>112.1</w:t>
             </w:r>
@@ -1086,16 +1356,19 @@
           <w:tcPr>
             <w:tcW w:type="dxa" w:w="1469"/>
             <w:vAlign w:val="center"/>
-            <w:shd w:fill="F6F8FA"/>
+            <w:shd w:fill="E5E5E5"/>
           </w:tcPr>
           <w:p>
             <w:pPr>
-              <w:spacing w:after="80" w:before="80"/>
+              <w:spacing w:after="40" w:before="40"/>
+              <w:jc w:val="left"/>
             </w:pPr>
             <w:r>
               <w:rPr>
+                <w:rFonts w:ascii="Arial" w:hAnsi="Arial" w:eastAsia="Arial" w:cs="Arial"/>
                 <w:b w:val="0"/>
-                <w:sz w:val="18"/>
+                <w:color w:val="000000"/>
+                <w:sz w:val="16"/>
               </w:rPr>
               <w:t>152.2</w:t>
             </w:r>
@@ -1105,16 +1378,19 @@
           <w:tcPr>
             <w:tcW w:type="dxa" w:w="1469"/>
             <w:vAlign w:val="center"/>
-            <w:shd w:fill="F6F8FA"/>
+            <w:shd w:fill="E5E5E5"/>
           </w:tcPr>
           <w:p>
             <w:pPr>
-              <w:spacing w:after="80" w:before="80"/>
+              <w:spacing w:after="40" w:before="40"/>
+              <w:jc w:val="left"/>
             </w:pPr>
             <w:r>
               <w:rPr>
+                <w:rFonts w:ascii="Arial" w:hAnsi="Arial" w:eastAsia="Arial" w:cs="Arial"/>
                 <w:b w:val="0"/>
-                <w:sz w:val="18"/>
+                <w:color w:val="000000"/>
+                <w:sz w:val="16"/>
               </w:rPr>
               <w:t>191.8</w:t>
             </w:r>
@@ -1122,66 +1398,142 @@
         </w:tc>
       </w:tr>
     </w:tbl>
-    <w:p/>
+    <w:p>
+      <w:pPr>
+        <w:jc w:val="left"/>
+      </w:pPr>
+    </w:p>
     <w:p>
       <w:pPr>
         <w:pStyle w:val="Heading2"/>
+        <w:jc w:val="left"/>
       </w:pPr>
       <w:r>
+        <w:rPr>
+          <w:rFonts w:ascii="Arial" w:hAnsi="Arial" w:eastAsia="Arial" w:cs="Arial"/>
+          <w:color w:val="000000"/>
+          <w:sz w:val="18"/>
+        </w:rPr>
         <w:t>Economic capital spending</w:t>
       </w:r>
     </w:p>
     <w:p>
+      <w:pPr>
+        <w:jc w:val="left"/>
+      </w:pPr>
       <w:r>
+        <w:rPr>
+          <w:rFonts w:ascii="Arial" w:hAnsi="Arial" w:eastAsia="Arial" w:cs="Arial"/>
+          <w:color w:val="000000"/>
+          <w:sz w:val="18"/>
+        </w:rPr>
         <w:t>New finance lease assets are included in reinvestment even when acquisition is noncash. Existing finance lease liabilities are deducted in the enterprise-to-equity bridge. Capitalized financing interest is removed from reported cash capex. Operating leases remain inside operating expenses, and their liabilities are removed from operating NWC without an additional financing deduction.</w:t>
       </w:r>
     </w:p>
     <w:p>
+      <w:pPr>
+        <w:jc w:val="left"/>
+      </w:pPr>
       <w:r>
+        <w:rPr>
+          <w:rFonts w:ascii="Arial" w:hAnsi="Arial" w:eastAsia="Arial" w:cs="Arial"/>
+          <w:color w:val="000000"/>
+          <w:sz w:val="18"/>
+        </w:rPr>
         <w:t>SBC remains expensed in EBIT and is never added back to FCFF. The displayed 3.75% compensation diagnostic retains the original forecast calibration. Future buybacks are not an additional source of value; funded repurchases consume equity value.</w:t>
       </w:r>
     </w:p>
     <w:p>
+      <w:pPr>
+        <w:jc w:val="left"/>
+      </w:pPr>
       <w:r>
+        <w:rPr>
+          <w:rFonts w:ascii="Arial" w:hAnsi="Arial" w:eastAsia="Arial" w:cs="Arial"/>
+          <w:color w:val="000000"/>
+          <w:sz w:val="18"/>
+        </w:rPr>
         <w:br w:type="page"/>
       </w:r>
     </w:p>
     <w:p>
       <w:pPr>
         <w:pStyle w:val="Heading1"/>
+        <w:jc w:val="center"/>
       </w:pPr>
       <w:r>
+        <w:rPr>
+          <w:rFonts w:ascii="Arial" w:hAnsi="Arial" w:eastAsia="Arial" w:cs="Arial"/>
+          <w:color w:val="000000"/>
+          <w:sz w:val="21"/>
+        </w:rPr>
         <w:t>Discounting stable value and the equity bridge</w:t>
       </w:r>
     </w:p>
     <w:p>
       <w:pPr>
         <w:pStyle w:val="Heading2"/>
+        <w:jc w:val="left"/>
       </w:pPr>
       <w:r>
+        <w:rPr>
+          <w:rFonts w:ascii="Arial" w:hAnsi="Arial" w:eastAsia="Arial" w:cs="Arial"/>
+          <w:color w:val="000000"/>
+          <w:sz w:val="18"/>
+        </w:rPr>
         <w:t>Remaining cash flow and timing</w:t>
       </w:r>
     </w:p>
     <w:p>
+      <w:pPr>
+        <w:jc w:val="left"/>
+      </w:pPr>
       <w:r>
+        <w:rPr>
+          <w:rFonts w:ascii="Arial" w:hAnsi="Arial" w:eastAsia="Arial" w:cs="Arial"/>
+          <w:color w:val="000000"/>
+          <w:sz w:val="18"/>
+        </w:rPr>
         <w:t>The valuation date is 8 October 2026. There are 265 days until 30 June 2027. The model scales annual FY2027 FCFF by 265/365 and discounts the remaining cash flow at the midpoint of that interval. Later explicit cash flows use fiscal midyear timing. A visible timing switch allows fiscal year-end discounting. Stable value is always discounted from 30 June 2031.</w:t>
       </w:r>
     </w:p>
     <w:p>
       <w:pPr>
         <w:pStyle w:val="Heading2"/>
+        <w:jc w:val="left"/>
       </w:pPr>
       <w:r>
+        <w:rPr>
+          <w:rFonts w:ascii="Arial" w:hAnsi="Arial" w:eastAsia="Arial" w:cs="Arial"/>
+          <w:color w:val="000000"/>
+          <w:sz w:val="18"/>
+        </w:rPr>
         <w:t>Stable investment requirement</w:t>
       </w:r>
     </w:p>
     <w:p>
+      <w:pPr>
+        <w:jc w:val="left"/>
+      </w:pPr>
       <w:r>
+        <w:rPr>
+          <w:rFonts w:ascii="Arial" w:hAnsi="Arial" w:eastAsia="Arial" w:cs="Arial"/>
+          <w:color w:val="000000"/>
+          <w:sz w:val="18"/>
+        </w:rPr>
         <w:t>Normalized FY2032 NOPAT equals FY2031 revenue times one plus stable growth, stable operating margin and one minus the stable tax rate. Reinvestment equals NOPAT times growth divided by ROIC. Normalized FCFF equals NOPAT less that reinvestment. Terminal value equals normalized FCFF divided by WACC less growth.</w:t>
       </w:r>
     </w:p>
     <w:p>
+      <w:pPr>
+        <w:jc w:val="left"/>
+      </w:pPr>
       <w:r>
+        <w:rPr>
+          <w:rFonts w:ascii="Arial" w:hAnsi="Arial" w:eastAsia="Arial" w:cs="Arial"/>
+          <w:color w:val="000000"/>
+          <w:sz w:val="18"/>
+        </w:rPr>
         <w:t>The primary method requires WACC greater than stable growth and ROIC greater than growth. A simple Gordon method that grows final explicit FCFF is shown as a crosscheck. An editable exit multiple provides a separate terminal convention. Neither replaces the primary reinvestment requirement without an explicit analyst choice.</w:t>
       </w:r>
     </w:p>
@@ -1191,6 +1543,14 @@
         <w:jc w:val="center"/>
         <w:tblLayout w:type="fixed"/>
         <w:tblLook w:firstColumn="1" w:firstRow="1" w:lastColumn="0" w:lastRow="0" w:noHBand="0" w:noVBand="1" w:val="04A0"/>
+        <w:tblBorders>
+          <w:top w:val="single" w:sz="4" w:color="000000"/>
+          <w:bottom w:val="single" w:sz="4" w:color="000000"/>
+          <w:insideH w:val="nil" w:sz="4" w:color="000000"/>
+          <w:left w:val="nil"/>
+          <w:right w:val="nil"/>
+          <w:insideV w:val="nil"/>
+        </w:tblBorders>
       </w:tblPr>
       <w:tblGrid>
         <w:gridCol w:w="6912"/>
@@ -1205,16 +1565,22 @@
           <w:tcPr>
             <w:tcW w:type="dxa" w:w="6912"/>
             <w:vAlign w:val="center"/>
-            <w:shd w:fill="EAF0F7"/>
+            <w:shd w:fill="FFFFFF"/>
+            <w:tcBorders>
+              <w:bottom w:val="single" w:sz="4" w:color="000000"/>
+            </w:tcBorders>
           </w:tcPr>
           <w:p>
             <w:pPr>
-              <w:spacing w:after="80" w:before="80"/>
+              <w:spacing w:after="40" w:before="40"/>
+              <w:jc w:val="left"/>
             </w:pPr>
             <w:r>
               <w:rPr>
+                <w:rFonts w:ascii="Arial" w:hAnsi="Arial" w:eastAsia="Arial" w:cs="Arial"/>
                 <w:b/>
-                <w:sz w:val="18"/>
+                <w:color w:val="000000"/>
+                <w:sz w:val="16"/>
               </w:rPr>
               <w:t>Valuation component</w:t>
             </w:r>
@@ -1224,16 +1590,22 @@
           <w:tcPr>
             <w:tcW w:type="dxa" w:w="2880"/>
             <w:vAlign w:val="center"/>
-            <w:shd w:fill="EAF0F7"/>
+            <w:shd w:fill="FFFFFF"/>
+            <w:tcBorders>
+              <w:bottom w:val="single" w:sz="4" w:color="000000"/>
+            </w:tcBorders>
           </w:tcPr>
           <w:p>
             <w:pPr>
-              <w:spacing w:after="80" w:before="80"/>
+              <w:spacing w:after="40" w:before="40"/>
+              <w:jc w:val="left"/>
             </w:pPr>
             <w:r>
               <w:rPr>
+                <w:rFonts w:ascii="Arial" w:hAnsi="Arial" w:eastAsia="Arial" w:cs="Arial"/>
                 <w:b/>
-                <w:sz w:val="18"/>
+                <w:color w:val="000000"/>
+                <w:sz w:val="16"/>
               </w:rPr>
               <w:t>USD millions</w:t>
             </w:r>
@@ -1248,16 +1620,19 @@
           <w:tcPr>
             <w:tcW w:type="dxa" w:w="6912"/>
             <w:vAlign w:val="center"/>
-            <w:shd w:fill="F6F8FA"/>
+            <w:shd w:fill="E5E5E5"/>
           </w:tcPr>
           <w:p>
             <w:pPr>
-              <w:spacing w:after="80" w:before="80"/>
+              <w:spacing w:after="40" w:before="40"/>
+              <w:jc w:val="left"/>
             </w:pPr>
             <w:r>
               <w:rPr>
+                <w:rFonts w:ascii="Arial" w:hAnsi="Arial" w:eastAsia="Arial" w:cs="Arial"/>
                 <w:b w:val="0"/>
-                <w:sz w:val="18"/>
+                <w:color w:val="000000"/>
+                <w:sz w:val="16"/>
               </w:rPr>
               <w:t>Explicit FCFF present value</w:t>
             </w:r>
@@ -1267,16 +1642,19 @@
           <w:tcPr>
             <w:tcW w:type="dxa" w:w="2880"/>
             <w:vAlign w:val="center"/>
-            <w:shd w:fill="F6F8FA"/>
+            <w:shd w:fill="E5E5E5"/>
           </w:tcPr>
           <w:p>
             <w:pPr>
-              <w:spacing w:after="80" w:before="80"/>
+              <w:spacing w:after="40" w:before="40"/>
+              <w:jc w:val="left"/>
             </w:pPr>
             <w:r>
               <w:rPr>
+                <w:rFonts w:ascii="Arial" w:hAnsi="Arial" w:eastAsia="Arial" w:cs="Arial"/>
                 <w:b w:val="0"/>
-                <w:sz w:val="18"/>
+                <w:color w:val="000000"/>
+                <w:sz w:val="16"/>
               </w:rPr>
               <w:t>436,119</w:t>
             </w:r>
@@ -1295,12 +1673,15 @@
           </w:tcPr>
           <w:p>
             <w:pPr>
-              <w:spacing w:after="80" w:before="80"/>
+              <w:spacing w:after="40" w:before="40"/>
+              <w:jc w:val="left"/>
             </w:pPr>
             <w:r>
               <w:rPr>
+                <w:rFonts w:ascii="Arial" w:hAnsi="Arial" w:eastAsia="Arial" w:cs="Arial"/>
                 <w:b w:val="0"/>
-                <w:sz w:val="18"/>
+                <w:color w:val="000000"/>
+                <w:sz w:val="16"/>
               </w:rPr>
               <w:t>Stable value present value</w:t>
             </w:r>
@@ -1314,12 +1695,15 @@
           </w:tcPr>
           <w:p>
             <w:pPr>
-              <w:spacing w:after="80" w:before="80"/>
+              <w:spacing w:after="40" w:before="40"/>
+              <w:jc w:val="left"/>
             </w:pPr>
             <w:r>
               <w:rPr>
+                <w:rFonts w:ascii="Arial" w:hAnsi="Arial" w:eastAsia="Arial" w:cs="Arial"/>
                 <w:b w:val="0"/>
-                <w:sz w:val="18"/>
+                <w:color w:val="000000"/>
+                <w:sz w:val="16"/>
               </w:rPr>
               <w:t>1,711,979</w:t>
             </w:r>
@@ -1334,16 +1718,19 @@
           <w:tcPr>
             <w:tcW w:type="dxa" w:w="6912"/>
             <w:vAlign w:val="center"/>
-            <w:shd w:fill="F6F8FA"/>
+            <w:shd w:fill="E5E5E5"/>
           </w:tcPr>
           <w:p>
             <w:pPr>
-              <w:spacing w:after="80" w:before="80"/>
+              <w:spacing w:after="40" w:before="40"/>
+              <w:jc w:val="left"/>
             </w:pPr>
             <w:r>
               <w:rPr>
+                <w:rFonts w:ascii="Arial" w:hAnsi="Arial" w:eastAsia="Arial" w:cs="Arial"/>
                 <w:b w:val="0"/>
-                <w:sz w:val="18"/>
+                <w:color w:val="000000"/>
+                <w:sz w:val="16"/>
               </w:rPr>
               <w:t>Operating enterprise value</w:t>
             </w:r>
@@ -1353,16 +1740,19 @@
           <w:tcPr>
             <w:tcW w:type="dxa" w:w="2880"/>
             <w:vAlign w:val="center"/>
-            <w:shd w:fill="F6F8FA"/>
+            <w:shd w:fill="E5E5E5"/>
           </w:tcPr>
           <w:p>
             <w:pPr>
-              <w:spacing w:after="80" w:before="80"/>
+              <w:spacing w:after="40" w:before="40"/>
+              <w:jc w:val="left"/>
             </w:pPr>
             <w:r>
               <w:rPr>
+                <w:rFonts w:ascii="Arial" w:hAnsi="Arial" w:eastAsia="Arial" w:cs="Arial"/>
                 <w:b w:val="0"/>
-                <w:sz w:val="18"/>
+                <w:color w:val="000000"/>
+                <w:sz w:val="16"/>
               </w:rPr>
               <w:t>2,148,097</w:t>
             </w:r>
@@ -1381,12 +1771,15 @@
           </w:tcPr>
           <w:p>
             <w:pPr>
-              <w:spacing w:after="80" w:before="80"/>
+              <w:spacing w:after="40" w:before="40"/>
+              <w:jc w:val="left"/>
             </w:pPr>
             <w:r>
               <w:rPr>
+                <w:rFonts w:ascii="Arial" w:hAnsi="Arial" w:eastAsia="Arial" w:cs="Arial"/>
                 <w:b w:val="0"/>
-                <w:sz w:val="18"/>
+                <w:color w:val="000000"/>
+                <w:sz w:val="16"/>
               </w:rPr>
               <w:t>Excess liquid assets</w:t>
             </w:r>
@@ -1400,12 +1793,15 @@
           </w:tcPr>
           <w:p>
             <w:pPr>
-              <w:spacing w:after="80" w:before="80"/>
+              <w:spacing w:after="40" w:before="40"/>
+              <w:jc w:val="left"/>
             </w:pPr>
             <w:r>
               <w:rPr>
+                <w:rFonts w:ascii="Arial" w:hAnsi="Arial" w:eastAsia="Arial" w:cs="Arial"/>
                 <w:b w:val="0"/>
-                <w:sz w:val="18"/>
+                <w:color w:val="000000"/>
+                <w:sz w:val="16"/>
               </w:rPr>
               <w:t>51,843</w:t>
             </w:r>
@@ -1420,16 +1816,19 @@
           <w:tcPr>
             <w:tcW w:type="dxa" w:w="6912"/>
             <w:vAlign w:val="center"/>
-            <w:shd w:fill="F6F8FA"/>
+            <w:shd w:fill="E5E5E5"/>
           </w:tcPr>
           <w:p>
             <w:pPr>
-              <w:spacing w:after="80" w:before="80"/>
+              <w:spacing w:after="40" w:before="40"/>
+              <w:jc w:val="left"/>
             </w:pPr>
             <w:r>
               <w:rPr>
+                <w:rFonts w:ascii="Arial" w:hAnsi="Arial" w:eastAsia="Arial" w:cs="Arial"/>
                 <w:b w:val="0"/>
-                <w:sz w:val="18"/>
+                <w:color w:val="000000"/>
+                <w:sz w:val="16"/>
               </w:rPr>
               <w:t>Equity investment value proxy</w:t>
             </w:r>
@@ -1439,16 +1838,19 @@
           <w:tcPr>
             <w:tcW w:type="dxa" w:w="2880"/>
             <w:vAlign w:val="center"/>
-            <w:shd w:fill="F6F8FA"/>
+            <w:shd w:fill="E5E5E5"/>
           </w:tcPr>
           <w:p>
             <w:pPr>
-              <w:spacing w:after="80" w:before="80"/>
+              <w:spacing w:after="40" w:before="40"/>
+              <w:jc w:val="left"/>
             </w:pPr>
             <w:r>
               <w:rPr>
+                <w:rFonts w:ascii="Arial" w:hAnsi="Arial" w:eastAsia="Arial" w:cs="Arial"/>
                 <w:b w:val="0"/>
-                <w:sz w:val="18"/>
+                <w:color w:val="000000"/>
+                <w:sz w:val="16"/>
               </w:rPr>
               <w:t>36,348</w:t>
             </w:r>
@@ -1467,12 +1869,15 @@
           </w:tcPr>
           <w:p>
             <w:pPr>
-              <w:spacing w:after="80" w:before="80"/>
+              <w:spacing w:after="40" w:before="40"/>
+              <w:jc w:val="left"/>
             </w:pPr>
             <w:r>
               <w:rPr>
+                <w:rFonts w:ascii="Arial" w:hAnsi="Arial" w:eastAsia="Arial" w:cs="Arial"/>
                 <w:b w:val="0"/>
-                <w:sz w:val="18"/>
+                <w:color w:val="000000"/>
+                <w:sz w:val="16"/>
               </w:rPr>
               <w:t>Debt fair value deduction</w:t>
             </w:r>
@@ -1486,12 +1891,15 @@
           </w:tcPr>
           <w:p>
             <w:pPr>
-              <w:spacing w:after="80" w:before="80"/>
+              <w:spacing w:after="40" w:before="40"/>
+              <w:jc w:val="left"/>
             </w:pPr>
             <w:r>
               <w:rPr>
+                <w:rFonts w:ascii="Arial" w:hAnsi="Arial" w:eastAsia="Arial" w:cs="Arial"/>
                 <w:b w:val="0"/>
-                <w:sz w:val="18"/>
+                <w:color w:val="000000"/>
+                <w:sz w:val="16"/>
               </w:rPr>
               <w:t>(36,500)</w:t>
             </w:r>
@@ -1506,16 +1914,19 @@
           <w:tcPr>
             <w:tcW w:type="dxa" w:w="6912"/>
             <w:vAlign w:val="center"/>
-            <w:shd w:fill="F6F8FA"/>
+            <w:shd w:fill="E5E5E5"/>
           </w:tcPr>
           <w:p>
             <w:pPr>
-              <w:spacing w:after="80" w:before="80"/>
+              <w:spacing w:after="40" w:before="40"/>
+              <w:jc w:val="left"/>
             </w:pPr>
             <w:r>
               <w:rPr>
+                <w:rFonts w:ascii="Arial" w:hAnsi="Arial" w:eastAsia="Arial" w:cs="Arial"/>
                 <w:b w:val="0"/>
-                <w:sz w:val="18"/>
+                <w:color w:val="000000"/>
+                <w:sz w:val="16"/>
               </w:rPr>
               <w:t>Finance lease liability deduction</w:t>
             </w:r>
@@ -1525,16 +1936,19 @@
           <w:tcPr>
             <w:tcW w:type="dxa" w:w="2880"/>
             <w:vAlign w:val="center"/>
-            <w:shd w:fill="F6F8FA"/>
+            <w:shd w:fill="E5E5E5"/>
           </w:tcPr>
           <w:p>
             <w:pPr>
-              <w:spacing w:after="80" w:before="80"/>
+              <w:spacing w:after="40" w:before="40"/>
+              <w:jc w:val="left"/>
             </w:pPr>
             <w:r>
               <w:rPr>
+                <w:rFonts w:ascii="Arial" w:hAnsi="Arial" w:eastAsia="Arial" w:cs="Arial"/>
                 <w:b w:val="0"/>
-                <w:sz w:val="18"/>
+                <w:color w:val="000000"/>
+                <w:sz w:val="16"/>
               </w:rPr>
               <w:t>(66,594)</w:t>
             </w:r>
@@ -1553,12 +1967,15 @@
           </w:tcPr>
           <w:p>
             <w:pPr>
-              <w:spacing w:after="80" w:before="80"/>
+              <w:spacing w:after="40" w:before="40"/>
+              <w:jc w:val="left"/>
             </w:pPr>
             <w:r>
               <w:rPr>
+                <w:rFonts w:ascii="Arial" w:hAnsi="Arial" w:eastAsia="Arial" w:cs="Arial"/>
                 <w:b w:val="0"/>
-                <w:sz w:val="18"/>
+                <w:color w:val="000000"/>
+                <w:sz w:val="16"/>
               </w:rPr>
               <w:t>Equity value</w:t>
             </w:r>
@@ -1572,12 +1989,15 @@
           </w:tcPr>
           <w:p>
             <w:pPr>
-              <w:spacing w:after="80" w:before="80"/>
+              <w:spacing w:after="40" w:before="40"/>
+              <w:jc w:val="left"/>
             </w:pPr>
             <w:r>
               <w:rPr>
+                <w:rFonts w:ascii="Arial" w:hAnsi="Arial" w:eastAsia="Arial" w:cs="Arial"/>
                 <w:b w:val="0"/>
-                <w:sz w:val="18"/>
+                <w:color w:val="000000"/>
+                <w:sz w:val="16"/>
               </w:rPr>
               <w:t>2,133,194</w:t>
             </w:r>
@@ -1592,16 +2012,19 @@
           <w:tcPr>
             <w:tcW w:type="dxa" w:w="6912"/>
             <w:vAlign w:val="center"/>
-            <w:shd w:fill="F6F8FA"/>
+            <w:shd w:fill="E5E5E5"/>
           </w:tcPr>
           <w:p>
             <w:pPr>
-              <w:spacing w:after="80" w:before="80"/>
+              <w:spacing w:after="40" w:before="40"/>
+              <w:jc w:val="left"/>
             </w:pPr>
             <w:r>
               <w:rPr>
+                <w:rFonts w:ascii="Arial" w:hAnsi="Arial" w:eastAsia="Arial" w:cs="Arial"/>
                 <w:b w:val="0"/>
-                <w:sz w:val="18"/>
+                <w:color w:val="000000"/>
+                <w:sz w:val="16"/>
               </w:rPr>
               <w:t>Million shares</w:t>
             </w:r>
@@ -1611,16 +2034,19 @@
           <w:tcPr>
             <w:tcW w:type="dxa" w:w="2880"/>
             <w:vAlign w:val="center"/>
-            <w:shd w:fill="F6F8FA"/>
+            <w:shd w:fill="E5E5E5"/>
           </w:tcPr>
           <w:p>
             <w:pPr>
-              <w:spacing w:after="80" w:before="80"/>
+              <w:spacing w:after="40" w:before="40"/>
+              <w:jc w:val="left"/>
             </w:pPr>
             <w:r>
               <w:rPr>
+                <w:rFonts w:ascii="Arial" w:hAnsi="Arial" w:eastAsia="Arial" w:cs="Arial"/>
                 <w:b w:val="0"/>
-                <w:sz w:val="18"/>
+                <w:color w:val="000000"/>
+                <w:sz w:val="16"/>
               </w:rPr>
               <w:t>7,449.545</w:t>
             </w:r>
@@ -1639,12 +2065,15 @@
           </w:tcPr>
           <w:p>
             <w:pPr>
-              <w:spacing w:after="80" w:before="80"/>
+              <w:spacing w:after="40" w:before="40"/>
+              <w:jc w:val="left"/>
             </w:pPr>
             <w:r>
               <w:rPr>
+                <w:rFonts w:ascii="Arial" w:hAnsi="Arial" w:eastAsia="Arial" w:cs="Arial"/>
                 <w:b w:val="0"/>
-                <w:sz w:val="18"/>
+                <w:color w:val="000000"/>
+                <w:sz w:val="16"/>
               </w:rPr>
               <w:t>USD per share</w:t>
             </w:r>
@@ -1658,12 +2087,15 @@
           </w:tcPr>
           <w:p>
             <w:pPr>
-              <w:spacing w:after="80" w:before="80"/>
+              <w:spacing w:after="40" w:before="40"/>
+              <w:jc w:val="left"/>
             </w:pPr>
             <w:r>
               <w:rPr>
+                <w:rFonts w:ascii="Arial" w:hAnsi="Arial" w:eastAsia="Arial" w:cs="Arial"/>
                 <w:b w:val="0"/>
-                <w:sz w:val="18"/>
+                <w:color w:val="000000"/>
+                <w:sz w:val="16"/>
               </w:rPr>
               <w:t>286.35</w:t>
             </w:r>
@@ -1671,35 +2103,75 @@
         </w:tc>
       </w:tr>
     </w:tbl>
-    <w:p/>
+    <w:p>
+      <w:pPr>
+        <w:jc w:val="left"/>
+      </w:pPr>
+    </w:p>
     <w:p>
       <w:pPr>
         <w:pStyle w:val="Heading2"/>
+        <w:jc w:val="left"/>
       </w:pPr>
       <w:r>
+        <w:rPr>
+          <w:rFonts w:ascii="Arial" w:hAnsi="Arial" w:eastAsia="Arial" w:cs="Arial"/>
+          <w:color w:val="000000"/>
+          <w:sz w:val="18"/>
+        </w:rPr>
         <w:t>Balance date and ownership conventions</w:t>
       </w:r>
     </w:p>
     <w:p>
+      <w:pPr>
+        <w:jc w:val="left"/>
+      </w:pPr>
       <w:r>
+        <w:rPr>
+          <w:rFonts w:ascii="Arial" w:hAnsi="Arial" w:eastAsia="Arial" w:cs="Arial"/>
+          <w:color w:val="000000"/>
+          <w:sz w:val="18"/>
+        </w:rPr>
         <w:t>Cash, investments, debt and leases are June disclosure proxies. Debt uses disclosed fair value, equity investments use carrying value times an editable factor, and excess liquid assets are measured after a USD 25 billion operating reserve. The share denominator combines 7,425.545491 million July point shares with a 24 million incremental weighted-share proxy. This is an explicit estimate of existing award overhang rather than an exact treasury-stock option calculation.</w:t>
       </w:r>
     </w:p>
     <w:p>
+      <w:pPr>
+        <w:jc w:val="left"/>
+      </w:pPr>
       <w:r>
+        <w:rPr>
+          <w:rFonts w:ascii="Arial" w:hAnsi="Arial" w:eastAsia="Arial" w:cs="Arial"/>
+          <w:color w:val="000000"/>
+          <w:sz w:val="18"/>
+        </w:rPr>
         <w:br w:type="page"/>
       </w:r>
     </w:p>
     <w:p>
       <w:pPr>
         <w:pStyle w:val="Heading1"/>
+        <w:jc w:val="center"/>
       </w:pPr>
       <w:r>
+        <w:rPr>
+          <w:rFonts w:ascii="Arial" w:hAnsi="Arial" w:eastAsia="Arial" w:cs="Arial"/>
+          <w:color w:val="000000"/>
+          <w:sz w:val="21"/>
+        </w:rPr>
         <w:t>Market implied operating expectations</w:t>
       </w:r>
     </w:p>
     <w:p>
+      <w:pPr>
+        <w:jc w:val="left"/>
+      </w:pPr>
       <w:r>
+        <w:rPr>
+          <w:rFonts w:ascii="Arial" w:hAnsi="Arial" w:eastAsia="Arial" w:cs="Arial"/>
+          <w:color w:val="000000"/>
+          <w:sz w:val="18"/>
+        </w:rPr>
         <w:t>Each reverse sheet solves the same market enterprise value with the same bridge. It changes one criterion and holds the other assumptions fixed. The solutions are separate diagnostic questions; combining them would create a different model.</w:t>
       </w:r>
     </w:p>
@@ -1709,6 +2181,14 @@
         <w:jc w:val="center"/>
         <w:tblLayout w:type="fixed"/>
         <w:tblLook w:firstColumn="1" w:firstRow="1" w:lastColumn="0" w:lastRow="0" w:noHBand="0" w:noVBand="1" w:val="04A0"/>
+        <w:tblBorders>
+          <w:top w:val="single" w:sz="4" w:color="000000"/>
+          <w:bottom w:val="single" w:sz="4" w:color="000000"/>
+          <w:insideH w:val="nil" w:sz="4" w:color="000000"/>
+          <w:left w:val="nil"/>
+          <w:right w:val="nil"/>
+          <w:insideV w:val="nil"/>
+        </w:tblBorders>
       </w:tblPr>
       <w:tblGrid>
         <w:gridCol w:w="3168"/>
@@ -1724,16 +2204,22 @@
           <w:tcPr>
             <w:tcW w:type="dxa" w:w="3168"/>
             <w:vAlign w:val="center"/>
-            <w:shd w:fill="EAF0F7"/>
+            <w:shd w:fill="FFFFFF"/>
+            <w:tcBorders>
+              <w:bottom w:val="single" w:sz="4" w:color="000000"/>
+            </w:tcBorders>
           </w:tcPr>
           <w:p>
             <w:pPr>
-              <w:spacing w:after="80" w:before="80"/>
+              <w:spacing w:after="40" w:before="40"/>
+              <w:jc w:val="left"/>
             </w:pPr>
             <w:r>
               <w:rPr>
+                <w:rFonts w:ascii="Arial" w:hAnsi="Arial" w:eastAsia="Arial" w:cs="Arial"/>
                 <w:b/>
-                <w:sz w:val="18"/>
+                <w:color w:val="000000"/>
+                <w:sz w:val="16"/>
               </w:rPr>
               <w:t>Criterion</w:t>
             </w:r>
@@ -1743,16 +2229,22 @@
           <w:tcPr>
             <w:tcW w:type="dxa" w:w="1872"/>
             <w:vAlign w:val="center"/>
-            <w:shd w:fill="EAF0F7"/>
+            <w:shd w:fill="FFFFFF"/>
+            <w:tcBorders>
+              <w:bottom w:val="single" w:sz="4" w:color="000000"/>
+            </w:tcBorders>
           </w:tcPr>
           <w:p>
             <w:pPr>
-              <w:spacing w:after="80" w:before="80"/>
+              <w:spacing w:after="40" w:before="40"/>
+              <w:jc w:val="left"/>
             </w:pPr>
             <w:r>
               <w:rPr>
+                <w:rFonts w:ascii="Arial" w:hAnsi="Arial" w:eastAsia="Arial" w:cs="Arial"/>
                 <w:b/>
-                <w:sz w:val="18"/>
+                <w:color w:val="000000"/>
+                <w:sz w:val="16"/>
               </w:rPr>
               <w:t>Base required result</w:t>
             </w:r>
@@ -1762,16 +2254,22 @@
           <w:tcPr>
             <w:tcW w:type="dxa" w:w="4752"/>
             <w:vAlign w:val="center"/>
-            <w:shd w:fill="EAF0F7"/>
+            <w:shd w:fill="FFFFFF"/>
+            <w:tcBorders>
+              <w:bottom w:val="single" w:sz="4" w:color="000000"/>
+            </w:tcBorders>
           </w:tcPr>
           <w:p>
             <w:pPr>
-              <w:spacing w:after="80" w:before="80"/>
+              <w:spacing w:after="40" w:before="40"/>
+              <w:jc w:val="left"/>
             </w:pPr>
             <w:r>
               <w:rPr>
+                <w:rFonts w:ascii="Arial" w:hAnsi="Arial" w:eastAsia="Arial" w:cs="Arial"/>
                 <w:b/>
-                <w:sz w:val="18"/>
+                <w:color w:val="000000"/>
+                <w:sz w:val="16"/>
               </w:rPr>
               <w:t>Economic interpretation</w:t>
             </w:r>
@@ -1786,16 +2284,19 @@
           <w:tcPr>
             <w:tcW w:type="dxa" w:w="3168"/>
             <w:vAlign w:val="center"/>
-            <w:shd w:fill="F6F8FA"/>
+            <w:shd w:fill="E5E5E5"/>
           </w:tcPr>
           <w:p>
             <w:pPr>
-              <w:spacing w:after="80" w:before="80"/>
+              <w:spacing w:after="40" w:before="40"/>
+              <w:jc w:val="left"/>
             </w:pPr>
             <w:r>
               <w:rPr>
+                <w:rFonts w:ascii="Arial" w:hAnsi="Arial" w:eastAsia="Arial" w:cs="Arial"/>
                 <w:b w:val="0"/>
-                <w:sz w:val="18"/>
+                <w:color w:val="000000"/>
+                <w:sz w:val="16"/>
               </w:rPr>
               <w:t>Uniform five year revenue CAGR</w:t>
             </w:r>
@@ -1805,16 +2306,19 @@
           <w:tcPr>
             <w:tcW w:type="dxa" w:w="1872"/>
             <w:vAlign w:val="center"/>
-            <w:shd w:fill="F6F8FA"/>
+            <w:shd w:fill="E5E5E5"/>
           </w:tcPr>
           <w:p>
             <w:pPr>
-              <w:spacing w:after="80" w:before="80"/>
+              <w:spacing w:after="40" w:before="40"/>
+              <w:jc w:val="left"/>
             </w:pPr>
             <w:r>
               <w:rPr>
+                <w:rFonts w:ascii="Arial" w:hAnsi="Arial" w:eastAsia="Arial" w:cs="Arial"/>
                 <w:b w:val="0"/>
-                <w:sz w:val="18"/>
+                <w:color w:val="000000"/>
+                <w:sz w:val="16"/>
               </w:rPr>
               <w:t>29.78%</w:t>
             </w:r>
@@ -1824,16 +2328,19 @@
           <w:tcPr>
             <w:tcW w:type="dxa" w:w="4752"/>
             <w:vAlign w:val="center"/>
-            <w:shd w:fill="F6F8FA"/>
+            <w:shd w:fill="E5E5E5"/>
           </w:tcPr>
           <w:p>
             <w:pPr>
-              <w:spacing w:after="80" w:before="80"/>
+              <w:spacing w:after="40" w:before="40"/>
+              <w:jc w:val="left"/>
             </w:pPr>
             <w:r>
               <w:rPr>
+                <w:rFonts w:ascii="Arial" w:hAnsi="Arial" w:eastAsia="Arial" w:cs="Arial"/>
                 <w:b w:val="0"/>
-                <w:sz w:val="18"/>
+                <w:color w:val="000000"/>
+                <w:sz w:val="16"/>
               </w:rPr>
               <w:t>Within displayed 0% to 35% analyst band</w:t>
             </w:r>
@@ -1852,12 +2359,15 @@
           </w:tcPr>
           <w:p>
             <w:pPr>
-              <w:spacing w:after="80" w:before="80"/>
+              <w:spacing w:after="40" w:before="40"/>
+              <w:jc w:val="left"/>
             </w:pPr>
             <w:r>
               <w:rPr>
+                <w:rFonts w:ascii="Arial" w:hAnsi="Arial" w:eastAsia="Arial" w:cs="Arial"/>
                 <w:b w:val="0"/>
-                <w:sz w:val="18"/>
+                <w:color w:val="000000"/>
+                <w:sz w:val="16"/>
               </w:rPr>
               <w:t>Parallel operating margin shift</w:t>
             </w:r>
@@ -1871,12 +2381,15 @@
           </w:tcPr>
           <w:p>
             <w:pPr>
-              <w:spacing w:after="80" w:before="80"/>
+              <w:spacing w:after="40" w:before="40"/>
+              <w:jc w:val="left"/>
             </w:pPr>
             <w:r>
               <w:rPr>
+                <w:rFonts w:ascii="Arial" w:hAnsi="Arial" w:eastAsia="Arial" w:cs="Arial"/>
                 <w:b w:val="0"/>
-                <w:sz w:val="18"/>
+                <w:color w:val="000000"/>
+                <w:sz w:val="16"/>
               </w:rPr>
               <w:t>+30.17%</w:t>
             </w:r>
@@ -1890,12 +2403,15 @@
           </w:tcPr>
           <w:p>
             <w:pPr>
-              <w:spacing w:after="80" w:before="80"/>
+              <w:spacing w:after="40" w:before="40"/>
+              <w:jc w:val="left"/>
             </w:pPr>
             <w:r>
               <w:rPr>
+                <w:rFonts w:ascii="Arial" w:hAnsi="Arial" w:eastAsia="Arial" w:cs="Arial"/>
                 <w:b w:val="0"/>
-                <w:sz w:val="18"/>
+                <w:color w:val="000000"/>
+                <w:sz w:val="16"/>
               </w:rPr>
               <w:t>Explicit and stable margins all rise by this amount</w:t>
             </w:r>
@@ -1910,16 +2426,19 @@
           <w:tcPr>
             <w:tcW w:type="dxa" w:w="3168"/>
             <w:vAlign w:val="center"/>
-            <w:shd w:fill="F6F8FA"/>
+            <w:shd w:fill="E5E5E5"/>
           </w:tcPr>
           <w:p>
             <w:pPr>
-              <w:spacing w:after="80" w:before="80"/>
+              <w:spacing w:after="40" w:before="40"/>
+              <w:jc w:val="left"/>
             </w:pPr>
             <w:r>
               <w:rPr>
+                <w:rFonts w:ascii="Arial" w:hAnsi="Arial" w:eastAsia="Arial" w:cs="Arial"/>
                 <w:b w:val="0"/>
-                <w:sz w:val="18"/>
+                <w:color w:val="000000"/>
+                <w:sz w:val="16"/>
               </w:rPr>
               <w:t>Stable margin alone</w:t>
             </w:r>
@@ -1929,16 +2448,19 @@
           <w:tcPr>
             <w:tcW w:type="dxa" w:w="1872"/>
             <w:vAlign w:val="center"/>
-            <w:shd w:fill="F6F8FA"/>
+            <w:shd w:fill="E5E5E5"/>
           </w:tcPr>
           <w:p>
             <w:pPr>
-              <w:spacing w:after="80" w:before="80"/>
+              <w:spacing w:after="40" w:before="40"/>
+              <w:jc w:val="left"/>
             </w:pPr>
             <w:r>
               <w:rPr>
+                <w:rFonts w:ascii="Arial" w:hAnsi="Arial" w:eastAsia="Arial" w:cs="Arial"/>
                 <w:b w:val="0"/>
-                <w:sz w:val="18"/>
+                <w:color w:val="000000"/>
+                <w:sz w:val="16"/>
               </w:rPr>
               <w:t>81.12%</w:t>
             </w:r>
@@ -1948,16 +2470,19 @@
           <w:tcPr>
             <w:tcW w:type="dxa" w:w="4752"/>
             <w:vAlign w:val="center"/>
-            <w:shd w:fill="F6F8FA"/>
+            <w:shd w:fill="E5E5E5"/>
           </w:tcPr>
           <w:p>
             <w:pPr>
-              <w:spacing w:after="80" w:before="80"/>
+              <w:spacing w:after="40" w:before="40"/>
+              <w:jc w:val="left"/>
             </w:pPr>
             <w:r>
               <w:rPr>
+                <w:rFonts w:ascii="Arial" w:hAnsi="Arial" w:eastAsia="Arial" w:cs="Arial"/>
                 <w:b w:val="0"/>
-                <w:sz w:val="18"/>
+                <w:color w:val="000000"/>
+                <w:sz w:val="16"/>
               </w:rPr>
               <w:t>Requires unusually high enduring operating margin</w:t>
             </w:r>
@@ -1976,12 +2501,15 @@
           </w:tcPr>
           <w:p>
             <w:pPr>
-              <w:spacing w:after="80" w:before="80"/>
+              <w:spacing w:after="40" w:before="40"/>
+              <w:jc w:val="left"/>
             </w:pPr>
             <w:r>
               <w:rPr>
+                <w:rFonts w:ascii="Arial" w:hAnsi="Arial" w:eastAsia="Arial" w:cs="Arial"/>
                 <w:b w:val="0"/>
-                <w:sz w:val="18"/>
+                <w:color w:val="000000"/>
+                <w:sz w:val="16"/>
               </w:rPr>
               <w:t>Explicit margin shift alone</w:t>
             </w:r>
@@ -1995,12 +2523,15 @@
           </w:tcPr>
           <w:p>
             <w:pPr>
-              <w:spacing w:after="80" w:before="80"/>
+              <w:spacing w:after="40" w:before="40"/>
+              <w:jc w:val="left"/>
             </w:pPr>
             <w:r>
               <w:rPr>
+                <w:rFonts w:ascii="Arial" w:hAnsi="Arial" w:eastAsia="Arial" w:cs="Arial"/>
                 <w:b w:val="0"/>
-                <w:sz w:val="18"/>
+                <w:color w:val="000000"/>
+                <w:sz w:val="16"/>
               </w:rPr>
               <w:t>+113.24%</w:t>
             </w:r>
@@ -2014,12 +2545,15 @@
           </w:tcPr>
           <w:p>
             <w:pPr>
-              <w:spacing w:after="80" w:before="80"/>
+              <w:spacing w:after="40" w:before="40"/>
+              <w:jc w:val="left"/>
             </w:pPr>
             <w:r>
               <w:rPr>
+                <w:rFonts w:ascii="Arial" w:hAnsi="Arial" w:eastAsia="Arial" w:cs="Arial"/>
                 <w:b w:val="0"/>
-                <w:sz w:val="18"/>
+                <w:color w:val="000000"/>
+                <w:sz w:val="16"/>
               </w:rPr>
               <w:t>Implies operating margins above 100%</w:t>
             </w:r>
@@ -2034,16 +2568,19 @@
           <w:tcPr>
             <w:tcW w:type="dxa" w:w="3168"/>
             <w:vAlign w:val="center"/>
-            <w:shd w:fill="F6F8FA"/>
+            <w:shd w:fill="E5E5E5"/>
           </w:tcPr>
           <w:p>
             <w:pPr>
-              <w:spacing w:after="80" w:before="80"/>
+              <w:spacing w:after="40" w:before="40"/>
+              <w:jc w:val="left"/>
             </w:pPr>
             <w:r>
               <w:rPr>
+                <w:rFonts w:ascii="Arial" w:hAnsi="Arial" w:eastAsia="Arial" w:cs="Arial"/>
                 <w:b w:val="0"/>
-                <w:sz w:val="18"/>
+                <w:color w:val="000000"/>
+                <w:sz w:val="16"/>
               </w:rPr>
               <w:t>Cash capex multiplier</w:t>
             </w:r>
@@ -2053,16 +2590,19 @@
           <w:tcPr>
             <w:tcW w:type="dxa" w:w="1872"/>
             <w:vAlign w:val="center"/>
-            <w:shd w:fill="F6F8FA"/>
+            <w:shd w:fill="E5E5E5"/>
           </w:tcPr>
           <w:p>
             <w:pPr>
-              <w:spacing w:after="80" w:before="80"/>
+              <w:spacing w:after="40" w:before="40"/>
+              <w:jc w:val="left"/>
             </w:pPr>
             <w:r>
               <w:rPr>
+                <w:rFonts w:ascii="Arial" w:hAnsi="Arial" w:eastAsia="Arial" w:cs="Arial"/>
                 <w:b w:val="0"/>
-                <w:sz w:val="18"/>
+                <w:color w:val="000000"/>
+                <w:sz w:val="16"/>
               </w:rPr>
               <w:t>-2.65x</w:t>
             </w:r>
@@ -2072,16 +2612,19 @@
           <w:tcPr>
             <w:tcW w:type="dxa" w:w="4752"/>
             <w:vAlign w:val="center"/>
-            <w:shd w:fill="F6F8FA"/>
+            <w:shd w:fill="E5E5E5"/>
           </w:tcPr>
           <w:p>
             <w:pPr>
-              <w:spacing w:after="80" w:before="80"/>
+              <w:spacing w:after="40" w:before="40"/>
+              <w:jc w:val="left"/>
             </w:pPr>
             <w:r>
               <w:rPr>
+                <w:rFonts w:ascii="Arial" w:hAnsi="Arial" w:eastAsia="Arial" w:cs="Arial"/>
                 <w:b w:val="0"/>
-                <w:sz w:val="18"/>
+                <w:color w:val="000000"/>
+                <w:sz w:val="16"/>
               </w:rPr>
               <w:t>Negative spending is rejected</w:t>
             </w:r>
@@ -2100,12 +2643,15 @@
           </w:tcPr>
           <w:p>
             <w:pPr>
-              <w:spacing w:after="80" w:before="80"/>
+              <w:spacing w:after="40" w:before="40"/>
+              <w:jc w:val="left"/>
             </w:pPr>
             <w:r>
               <w:rPr>
+                <w:rFonts w:ascii="Arial" w:hAnsi="Arial" w:eastAsia="Arial" w:cs="Arial"/>
                 <w:b w:val="0"/>
-                <w:sz w:val="18"/>
+                <w:color w:val="000000"/>
+                <w:sz w:val="16"/>
               </w:rPr>
               <w:t>Operating NWC ratio shift</w:t>
             </w:r>
@@ -2119,12 +2665,15 @@
           </w:tcPr>
           <w:p>
             <w:pPr>
-              <w:spacing w:after="80" w:before="80"/>
+              <w:spacing w:after="40" w:before="40"/>
+              <w:jc w:val="left"/>
             </w:pPr>
             <w:r>
               <w:rPr>
+                <w:rFonts w:ascii="Arial" w:hAnsi="Arial" w:eastAsia="Arial" w:cs="Arial"/>
                 <w:b w:val="0"/>
-                <w:sz w:val="18"/>
+                <w:color w:val="000000"/>
+                <w:sz w:val="16"/>
               </w:rPr>
               <w:t>-371.51%</w:t>
             </w:r>
@@ -2138,12 +2687,15 @@
           </w:tcPr>
           <w:p>
             <w:pPr>
-              <w:spacing w:after="80" w:before="80"/>
+              <w:spacing w:after="40" w:before="40"/>
+              <w:jc w:val="left"/>
             </w:pPr>
             <w:r>
               <w:rPr>
+                <w:rFonts w:ascii="Arial" w:hAnsi="Arial" w:eastAsia="Arial" w:cs="Arial"/>
                 <w:b w:val="0"/>
-                <w:sz w:val="18"/>
+                <w:color w:val="000000"/>
+                <w:sz w:val="16"/>
               </w:rPr>
               <w:t>Outside +/-10 pp displayed analyst band</w:t>
             </w:r>
@@ -2158,16 +2710,19 @@
           <w:tcPr>
             <w:tcW w:type="dxa" w:w="3168"/>
             <w:vAlign w:val="center"/>
-            <w:shd w:fill="F6F8FA"/>
+            <w:shd w:fill="E5E5E5"/>
           </w:tcPr>
           <w:p>
             <w:pPr>
-              <w:spacing w:after="80" w:before="80"/>
+              <w:spacing w:after="40" w:before="40"/>
+              <w:jc w:val="left"/>
             </w:pPr>
             <w:r>
               <w:rPr>
+                <w:rFonts w:ascii="Arial" w:hAnsi="Arial" w:eastAsia="Arial" w:cs="Arial"/>
                 <w:b w:val="0"/>
-                <w:sz w:val="18"/>
+                <w:color w:val="000000"/>
+                <w:sz w:val="16"/>
               </w:rPr>
               <w:t>Receivables only equivalent</w:t>
             </w:r>
@@ -2177,16 +2732,19 @@
           <w:tcPr>
             <w:tcW w:type="dxa" w:w="1872"/>
             <w:vAlign w:val="center"/>
-            <w:shd w:fill="F6F8FA"/>
+            <w:shd w:fill="E5E5E5"/>
           </w:tcPr>
           <w:p>
             <w:pPr>
-              <w:spacing w:after="80" w:before="80"/>
+              <w:spacing w:after="40" w:before="40"/>
+              <w:jc w:val="left"/>
             </w:pPr>
             <w:r>
               <w:rPr>
+                <w:rFonts w:ascii="Arial" w:hAnsi="Arial" w:eastAsia="Arial" w:cs="Arial"/>
                 <w:b w:val="0"/>
-                <w:sz w:val="18"/>
+                <w:color w:val="000000"/>
+                <w:sz w:val="16"/>
               </w:rPr>
               <w:t>-1356 days</w:t>
             </w:r>
@@ -2196,16 +2754,19 @@
           <w:tcPr>
             <w:tcW w:type="dxa" w:w="4752"/>
             <w:vAlign w:val="center"/>
-            <w:shd w:fill="F6F8FA"/>
+            <w:shd w:fill="E5E5E5"/>
           </w:tcPr>
           <w:p>
             <w:pPr>
-              <w:spacing w:after="80" w:before="80"/>
+              <w:spacing w:after="40" w:before="40"/>
+              <w:jc w:val="left"/>
             </w:pPr>
             <w:r>
               <w:rPr>
+                <w:rFonts w:ascii="Arial" w:hAnsi="Arial" w:eastAsia="Arial" w:cs="Arial"/>
                 <w:b w:val="0"/>
-                <w:sz w:val="18"/>
+                <w:color w:val="000000"/>
+                <w:sz w:val="16"/>
               </w:rPr>
               <w:t>Algebraic DSO equivalent outside feasible collection days</w:t>
             </w:r>
@@ -2224,12 +2785,15 @@
           </w:tcPr>
           <w:p>
             <w:pPr>
-              <w:spacing w:after="80" w:before="80"/>
+              <w:spacing w:after="40" w:before="40"/>
+              <w:jc w:val="left"/>
             </w:pPr>
             <w:r>
               <w:rPr>
+                <w:rFonts w:ascii="Arial" w:hAnsi="Arial" w:eastAsia="Arial" w:cs="Arial"/>
                 <w:b w:val="0"/>
-                <w:sz w:val="18"/>
+                <w:color w:val="000000"/>
+                <w:sz w:val="16"/>
               </w:rPr>
               <w:t>Finance lease asset multiplier</w:t>
             </w:r>
@@ -2243,12 +2807,15 @@
           </w:tcPr>
           <w:p>
             <w:pPr>
-              <w:spacing w:after="80" w:before="80"/>
+              <w:spacing w:after="40" w:before="40"/>
+              <w:jc w:val="left"/>
             </w:pPr>
             <w:r>
               <w:rPr>
+                <w:rFonts w:ascii="Arial" w:hAnsi="Arial" w:eastAsia="Arial" w:cs="Arial"/>
                 <w:b w:val="0"/>
-                <w:sz w:val="18"/>
+                <w:color w:val="000000"/>
+                <w:sz w:val="16"/>
               </w:rPr>
               <w:t>-13.14x</w:t>
             </w:r>
@@ -2262,12 +2829,15 @@
           </w:tcPr>
           <w:p>
             <w:pPr>
-              <w:spacing w:after="80" w:before="80"/>
+              <w:spacing w:after="40" w:before="40"/>
+              <w:jc w:val="left"/>
             </w:pPr>
             <w:r>
               <w:rPr>
+                <w:rFonts w:ascii="Arial" w:hAnsi="Arial" w:eastAsia="Arial" w:cs="Arial"/>
                 <w:b w:val="0"/>
-                <w:sz w:val="18"/>
+                <w:color w:val="000000"/>
+                <w:sz w:val="16"/>
               </w:rPr>
               <w:t>Negative asset acquisition is rejected</w:t>
             </w:r>
@@ -2282,16 +2852,19 @@
           <w:tcPr>
             <w:tcW w:type="dxa" w:w="3168"/>
             <w:vAlign w:val="center"/>
-            <w:shd w:fill="F6F8FA"/>
+            <w:shd w:fill="E5E5E5"/>
           </w:tcPr>
           <w:p>
             <w:pPr>
-              <w:spacing w:after="80" w:before="80"/>
+              <w:spacing w:after="40" w:before="40"/>
+              <w:jc w:val="left"/>
             </w:pPr>
             <w:r>
               <w:rPr>
+                <w:rFonts w:ascii="Arial" w:hAnsi="Arial" w:eastAsia="Arial" w:cs="Arial"/>
                 <w:b w:val="0"/>
-                <w:sz w:val="18"/>
+                <w:color w:val="000000"/>
+                <w:sz w:val="16"/>
               </w:rPr>
               <w:t>Operating tax rate shift</w:t>
             </w:r>
@@ -2301,16 +2874,19 @@
           <w:tcPr>
             <w:tcW w:type="dxa" w:w="1872"/>
             <w:vAlign w:val="center"/>
-            <w:shd w:fill="F6F8FA"/>
+            <w:shd w:fill="E5E5E5"/>
           </w:tcPr>
           <w:p>
             <w:pPr>
-              <w:spacing w:after="80" w:before="80"/>
+              <w:spacing w:after="40" w:before="40"/>
+              <w:jc w:val="left"/>
             </w:pPr>
             <w:r>
               <w:rPr>
+                <w:rFonts w:ascii="Arial" w:hAnsi="Arial" w:eastAsia="Arial" w:cs="Arial"/>
                 <w:b w:val="0"/>
-                <w:sz w:val="18"/>
+                <w:color w:val="000000"/>
+                <w:sz w:val="16"/>
               </w:rPr>
               <w:t>-60.14%</w:t>
             </w:r>
@@ -2320,16 +2896,19 @@
           <w:tcPr>
             <w:tcW w:type="dxa" w:w="4752"/>
             <w:vAlign w:val="center"/>
-            <w:shd w:fill="F6F8FA"/>
+            <w:shd w:fill="E5E5E5"/>
           </w:tcPr>
           <w:p>
             <w:pPr>
-              <w:spacing w:after="80" w:before="80"/>
+              <w:spacing w:after="40" w:before="40"/>
+              <w:jc w:val="left"/>
             </w:pPr>
             <w:r>
               <w:rPr>
+                <w:rFonts w:ascii="Arial" w:hAnsi="Arial" w:eastAsia="Arial" w:cs="Arial"/>
                 <w:b w:val="0"/>
-                <w:sz w:val="18"/>
+                <w:color w:val="000000"/>
+                <w:sz w:val="16"/>
               </w:rPr>
               <w:t>Implies negative stable and explicit tax rates</w:t>
             </w:r>
@@ -2337,48 +2916,102 @@
         </w:tc>
       </w:tr>
     </w:tbl>
-    <w:p/>
+    <w:p>
+      <w:pPr>
+        <w:jc w:val="left"/>
+      </w:pPr>
+    </w:p>
     <w:p>
       <w:pPr>
         <w:pStyle w:val="Heading2"/>
+        <w:jc w:val="left"/>
       </w:pPr>
       <w:r>
+        <w:rPr>
+          <w:rFonts w:ascii="Arial" w:hAnsi="Arial" w:eastAsia="Arial" w:cs="Arial"/>
+          <w:color w:val="000000"/>
+          <w:sz w:val="18"/>
+        </w:rPr>
         <w:t>Growth and profitability tradeoffs</w:t>
       </w:r>
     </w:p>
     <w:p>
+      <w:pPr>
+        <w:jc w:val="left"/>
+      </w:pPr>
       <w:r>
+        <w:rPr>
+          <w:rFonts w:ascii="Arial" w:hAnsi="Arial" w:eastAsia="Arial" w:cs="Arial"/>
+          <w:color w:val="000000"/>
+          <w:sz w:val="18"/>
+        </w:rPr>
         <w:t>The revenue test replaces the three segment paths with one constant CAGR from FY2026. Selected margin, tax, investment and NWC ratios remain fixed. A high revenue result therefore also scales investment and working capital needs. It does not assume that higher revenue arrives without cash investment.</w:t>
       </w:r>
     </w:p>
     <w:p>
+      <w:pPr>
+        <w:jc w:val="left"/>
+      </w:pPr>
       <w:r>
+        <w:rPr>
+          <w:rFonts w:ascii="Arial" w:hAnsi="Arial" w:eastAsia="Arial" w:cs="Arial"/>
+          <w:color w:val="000000"/>
+          <w:sz w:val="18"/>
+        </w:rPr>
         <w:t>The parallel margin test adds the same percentage-point amount to each explicit margin and the stable margin. Separate tests isolate explicit profitability and stable profitability. Required margins must be checked against operating bounds and the costs of achieving those improvements.</w:t>
       </w:r>
     </w:p>
     <w:p>
       <w:pPr>
         <w:pStyle w:val="Heading2"/>
+        <w:jc w:val="left"/>
       </w:pPr>
       <w:r>
+        <w:rPr>
+          <w:rFonts w:ascii="Arial" w:hAnsi="Arial" w:eastAsia="Arial" w:cs="Arial"/>
+          <w:color w:val="000000"/>
+          <w:sz w:val="18"/>
+        </w:rPr>
         <w:t>Capital intensity and tax tests</w:t>
       </w:r>
     </w:p>
     <w:p>
+      <w:pPr>
+        <w:jc w:val="left"/>
+      </w:pPr>
       <w:r>
+        <w:rPr>
+          <w:rFonts w:ascii="Arial" w:hAnsi="Arial" w:eastAsia="Arial" w:cs="Arial"/>
+          <w:color w:val="000000"/>
+          <w:sz w:val="18"/>
+        </w:rPr>
         <w:t>Capex, finance lease additions and NWC are linear cash-flow sensitivities with D&amp;A and stable ROIC held fixed. They are not new asset capacity plans. The tax test shifts operating taxes while holding the WACC debt shield fixed. Negative solutions identify which isolated interpretation cannot explain the price.</w:t>
       </w:r>
     </w:p>
     <w:p>
+      <w:pPr>
+        <w:jc w:val="left"/>
+      </w:pPr>
       <w:r>
+        <w:rPr>
+          <w:rFonts w:ascii="Arial" w:hAnsi="Arial" w:eastAsia="Arial" w:cs="Arial"/>
+          <w:color w:val="000000"/>
+          <w:sz w:val="18"/>
+        </w:rPr>
         <w:br w:type="page"/>
       </w:r>
     </w:p>
     <w:p>
       <w:pPr>
         <w:pStyle w:val="Heading1"/>
+        <w:jc w:val="center"/>
       </w:pPr>
       <w:r>
+        <w:rPr>
+          <w:rFonts w:ascii="Arial" w:hAnsi="Arial" w:eastAsia="Arial" w:cs="Arial"/>
+          <w:color w:val="000000"/>
+          <w:sz w:val="21"/>
+        </w:rPr>
         <w:t>Market implied valuation and stable economics</w:t>
       </w:r>
     </w:p>
@@ -2388,6 +3021,14 @@
         <w:jc w:val="center"/>
         <w:tblLayout w:type="fixed"/>
         <w:tblLook w:firstColumn="1" w:firstRow="1" w:lastColumn="0" w:lastRow="0" w:noHBand="0" w:noVBand="1" w:val="04A0"/>
+        <w:tblBorders>
+          <w:top w:val="single" w:sz="4" w:color="000000"/>
+          <w:bottom w:val="single" w:sz="4" w:color="000000"/>
+          <w:insideH w:val="nil" w:sz="4" w:color="000000"/>
+          <w:left w:val="nil"/>
+          <w:right w:val="nil"/>
+          <w:insideV w:val="nil"/>
+        </w:tblBorders>
       </w:tblPr>
       <w:tblGrid>
         <w:gridCol w:w="3672"/>
@@ -2403,16 +3044,22 @@
           <w:tcPr>
             <w:tcW w:type="dxa" w:w="3672"/>
             <w:vAlign w:val="center"/>
-            <w:shd w:fill="EAF0F7"/>
+            <w:shd w:fill="FFFFFF"/>
+            <w:tcBorders>
+              <w:bottom w:val="single" w:sz="4" w:color="000000"/>
+            </w:tcBorders>
           </w:tcPr>
           <w:p>
             <w:pPr>
-              <w:spacing w:after="80" w:before="80"/>
+              <w:spacing w:after="40" w:before="40"/>
+              <w:jc w:val="left"/>
             </w:pPr>
             <w:r>
               <w:rPr>
+                <w:rFonts w:ascii="Arial" w:hAnsi="Arial" w:eastAsia="Arial" w:cs="Arial"/>
                 <w:b/>
-                <w:sz w:val="18"/>
+                <w:color w:val="000000"/>
+                <w:sz w:val="16"/>
               </w:rPr>
               <w:t>Criterion</w:t>
             </w:r>
@@ -2422,16 +3069,22 @@
           <w:tcPr>
             <w:tcW w:type="dxa" w:w="2088"/>
             <w:vAlign w:val="center"/>
-            <w:shd w:fill="EAF0F7"/>
+            <w:shd w:fill="FFFFFF"/>
+            <w:tcBorders>
+              <w:bottom w:val="single" w:sz="4" w:color="000000"/>
+            </w:tcBorders>
           </w:tcPr>
           <w:p>
             <w:pPr>
-              <w:spacing w:after="80" w:before="80"/>
+              <w:spacing w:after="40" w:before="40"/>
+              <w:jc w:val="left"/>
             </w:pPr>
             <w:r>
               <w:rPr>
+                <w:rFonts w:ascii="Arial" w:hAnsi="Arial" w:eastAsia="Arial" w:cs="Arial"/>
                 <w:b/>
-                <w:sz w:val="18"/>
+                <w:color w:val="000000"/>
+                <w:sz w:val="16"/>
               </w:rPr>
               <w:t>Required result</w:t>
             </w:r>
@@ -2441,16 +3094,22 @@
           <w:tcPr>
             <w:tcW w:type="dxa" w:w="4032"/>
             <w:vAlign w:val="center"/>
-            <w:shd w:fill="EAF0F7"/>
+            <w:shd w:fill="FFFFFF"/>
+            <w:tcBorders>
+              <w:bottom w:val="single" w:sz="4" w:color="000000"/>
+            </w:tcBorders>
           </w:tcPr>
           <w:p>
             <w:pPr>
-              <w:spacing w:after="80" w:before="80"/>
+              <w:spacing w:after="40" w:before="40"/>
+              <w:jc w:val="left"/>
             </w:pPr>
             <w:r>
               <w:rPr>
+                <w:rFonts w:ascii="Arial" w:hAnsi="Arial" w:eastAsia="Arial" w:cs="Arial"/>
                 <w:b/>
-                <w:sz w:val="18"/>
+                <w:color w:val="000000"/>
+                <w:sz w:val="16"/>
               </w:rPr>
               <w:t>Interpretation</w:t>
             </w:r>
@@ -2465,16 +3124,19 @@
           <w:tcPr>
             <w:tcW w:type="dxa" w:w="3672"/>
             <w:vAlign w:val="center"/>
-            <w:shd w:fill="F6F8FA"/>
+            <w:shd w:fill="E5E5E5"/>
           </w:tcPr>
           <w:p>
             <w:pPr>
-              <w:spacing w:after="80" w:before="80"/>
+              <w:spacing w:after="40" w:before="40"/>
+              <w:jc w:val="left"/>
             </w:pPr>
             <w:r>
               <w:rPr>
+                <w:rFonts w:ascii="Arial" w:hAnsi="Arial" w:eastAsia="Arial" w:cs="Arial"/>
                 <w:b w:val="0"/>
-                <w:sz w:val="18"/>
+                <w:color w:val="000000"/>
+                <w:sz w:val="16"/>
               </w:rPr>
               <w:t>WACC</w:t>
             </w:r>
@@ -2484,16 +3146,19 @@
           <w:tcPr>
             <w:tcW w:type="dxa" w:w="2088"/>
             <w:vAlign w:val="center"/>
-            <w:shd w:fill="F6F8FA"/>
+            <w:shd w:fill="E5E5E5"/>
           </w:tcPr>
           <w:p>
             <w:pPr>
-              <w:spacing w:after="80" w:before="80"/>
+              <w:spacing w:after="40" w:before="40"/>
+              <w:jc w:val="left"/>
             </w:pPr>
             <w:r>
               <w:rPr>
+                <w:rFonts w:ascii="Arial" w:hAnsi="Arial" w:eastAsia="Arial" w:cs="Arial"/>
                 <w:b w:val="0"/>
-                <w:sz w:val="18"/>
+                <w:color w:val="000000"/>
+                <w:sz w:val="16"/>
               </w:rPr>
               <w:t>6.860%</w:t>
             </w:r>
@@ -2503,16 +3168,19 @@
           <w:tcPr>
             <w:tcW w:type="dxa" w:w="4032"/>
             <w:vAlign w:val="center"/>
-            <w:shd w:fill="F6F8FA"/>
+            <w:shd w:fill="E5E5E5"/>
           </w:tcPr>
           <w:p>
             <w:pPr>
-              <w:spacing w:after="80" w:before="80"/>
+              <w:spacing w:after="40" w:before="40"/>
+              <w:jc w:val="left"/>
             </w:pPr>
             <w:r>
               <w:rPr>
+                <w:rFonts w:ascii="Arial" w:hAnsi="Arial" w:eastAsia="Arial" w:cs="Arial"/>
                 <w:b w:val="0"/>
-                <w:sz w:val="18"/>
+                <w:color w:val="000000"/>
+                <w:sz w:val="16"/>
               </w:rPr>
               <w:t>Compare with calculated 9.814%</w:t>
             </w:r>
@@ -2531,12 +3199,15 @@
           </w:tcPr>
           <w:p>
             <w:pPr>
-              <w:spacing w:after="80" w:before="80"/>
+              <w:spacing w:after="40" w:before="40"/>
+              <w:jc w:val="left"/>
             </w:pPr>
             <w:r>
               <w:rPr>
+                <w:rFonts w:ascii="Arial" w:hAnsi="Arial" w:eastAsia="Arial" w:cs="Arial"/>
                 <w:b w:val="0"/>
-                <w:sz w:val="18"/>
+                <w:color w:val="000000"/>
+                <w:sz w:val="16"/>
               </w:rPr>
               <w:t>Stable growth</w:t>
             </w:r>
@@ -2550,12 +3221,15 @@
           </w:tcPr>
           <w:p>
             <w:pPr>
-              <w:spacing w:after="80" w:before="80"/>
+              <w:spacing w:after="40" w:before="40"/>
+              <w:jc w:val="left"/>
             </w:pPr>
             <w:r>
               <w:rPr>
+                <w:rFonts w:ascii="Arial" w:hAnsi="Arial" w:eastAsia="Arial" w:cs="Arial"/>
                 <w:b w:val="0"/>
-                <w:sz w:val="18"/>
+                <w:color w:val="000000"/>
+                <w:sz w:val="16"/>
               </w:rPr>
               <w:t>7.177%</w:t>
             </w:r>
@@ -2569,12 +3243,15 @@
           </w:tcPr>
           <w:p>
             <w:pPr>
-              <w:spacing w:after="80" w:before="80"/>
+              <w:spacing w:after="40" w:before="40"/>
+              <w:jc w:val="left"/>
             </w:pPr>
             <w:r>
               <w:rPr>
+                <w:rFonts w:ascii="Arial" w:hAnsi="Arial" w:eastAsia="Arial" w:cs="Arial"/>
                 <w:b w:val="0"/>
-                <w:sz w:val="18"/>
+                <w:color w:val="000000"/>
+                <w:sz w:val="16"/>
               </w:rPr>
               <w:t>Outside displayed 0% to 5% long-run analyst band</w:t>
             </w:r>
@@ -2589,16 +3266,19 @@
           <w:tcPr>
             <w:tcW w:type="dxa" w:w="3672"/>
             <w:vAlign w:val="center"/>
-            <w:shd w:fill="F6F8FA"/>
+            <w:shd w:fill="E5E5E5"/>
           </w:tcPr>
           <w:p>
             <w:pPr>
-              <w:spacing w:after="80" w:before="80"/>
+              <w:spacing w:after="40" w:before="40"/>
+              <w:jc w:val="left"/>
             </w:pPr>
             <w:r>
               <w:rPr>
+                <w:rFonts w:ascii="Arial" w:hAnsi="Arial" w:eastAsia="Arial" w:cs="Arial"/>
                 <w:b w:val="0"/>
-                <w:sz w:val="18"/>
+                <w:color w:val="000000"/>
+                <w:sz w:val="16"/>
               </w:rPr>
               <w:t>Stable ROIC</w:t>
             </w:r>
@@ -2608,16 +3288,19 @@
           <w:tcPr>
             <w:tcW w:type="dxa" w:w="2088"/>
             <w:vAlign w:val="center"/>
-            <w:shd w:fill="F6F8FA"/>
+            <w:shd w:fill="E5E5E5"/>
           </w:tcPr>
           <w:p>
             <w:pPr>
-              <w:spacing w:after="80" w:before="80"/>
+              <w:spacing w:after="40" w:before="40"/>
+              <w:jc w:val="left"/>
             </w:pPr>
             <w:r>
               <w:rPr>
+                <w:rFonts w:ascii="Arial" w:hAnsi="Arial" w:eastAsia="Arial" w:cs="Arial"/>
                 <w:b w:val="0"/>
-                <w:sz w:val="18"/>
+                <w:color w:val="000000"/>
+                <w:sz w:val="16"/>
               </w:rPr>
               <w:t>No finite positive value</w:t>
             </w:r>
@@ -2627,16 +3310,19 @@
           <w:tcPr>
             <w:tcW w:type="dxa" w:w="4032"/>
             <w:vAlign w:val="center"/>
-            <w:shd w:fill="F6F8FA"/>
+            <w:shd w:fill="E5E5E5"/>
           </w:tcPr>
           <w:p>
             <w:pPr>
-              <w:spacing w:after="80" w:before="80"/>
+              <w:spacing w:after="40" w:before="40"/>
+              <w:jc w:val="left"/>
             </w:pPr>
             <w:r>
               <w:rPr>
+                <w:rFonts w:ascii="Arial" w:hAnsi="Arial" w:eastAsia="Arial" w:cs="Arial"/>
                 <w:b w:val="0"/>
-                <w:sz w:val="18"/>
+                <w:color w:val="000000"/>
+                <w:sz w:val="16"/>
               </w:rPr>
               <w:t>Required cash exceeds stable NOPAT ceiling</w:t>
             </w:r>
@@ -2655,12 +3341,15 @@
           </w:tcPr>
           <w:p>
             <w:pPr>
-              <w:spacing w:after="80" w:before="80"/>
+              <w:spacing w:after="40" w:before="40"/>
+              <w:jc w:val="left"/>
             </w:pPr>
             <w:r>
               <w:rPr>
+                <w:rFonts w:ascii="Arial" w:hAnsi="Arial" w:eastAsia="Arial" w:cs="Arial"/>
                 <w:b w:val="0"/>
-                <w:sz w:val="18"/>
+                <w:color w:val="000000"/>
+                <w:sz w:val="16"/>
               </w:rPr>
               <w:t>Price as ROIC tends to infinity</w:t>
             </w:r>
@@ -2674,12 +3363,15 @@
           </w:tcPr>
           <w:p>
             <w:pPr>
-              <w:spacing w:after="80" w:before="80"/>
+              <w:spacing w:after="40" w:before="40"/>
+              <w:jc w:val="left"/>
             </w:pPr>
             <w:r>
               <w:rPr>
+                <w:rFonts w:ascii="Arial" w:hAnsi="Arial" w:eastAsia="Arial" w:cs="Arial"/>
                 <w:b w:val="0"/>
-                <w:sz w:val="18"/>
+                <w:color w:val="000000"/>
+                <w:sz w:val="16"/>
               </w:rPr>
               <w:t>$326.91</w:t>
             </w:r>
@@ -2693,12 +3385,15 @@
           </w:tcPr>
           <w:p>
             <w:pPr>
-              <w:spacing w:after="80" w:before="80"/>
+              <w:spacing w:after="40" w:before="40"/>
+              <w:jc w:val="left"/>
             </w:pPr>
             <w:r>
               <w:rPr>
+                <w:rFonts w:ascii="Arial" w:hAnsi="Arial" w:eastAsia="Arial" w:cs="Arial"/>
                 <w:b w:val="0"/>
-                <w:sz w:val="18"/>
+                <w:color w:val="000000"/>
+                <w:sz w:val="16"/>
               </w:rPr>
               <w:t>Still below observed $522.61</w:t>
             </w:r>
@@ -2713,16 +3408,19 @@
           <w:tcPr>
             <w:tcW w:type="dxa" w:w="3672"/>
             <w:vAlign w:val="center"/>
-            <w:shd w:fill="F6F8FA"/>
+            <w:shd w:fill="E5E5E5"/>
           </w:tcPr>
           <w:p>
             <w:pPr>
-              <w:spacing w:after="80" w:before="80"/>
+              <w:spacing w:after="40" w:before="40"/>
+              <w:jc w:val="left"/>
             </w:pPr>
             <w:r>
               <w:rPr>
+                <w:rFonts w:ascii="Arial" w:hAnsi="Arial" w:eastAsia="Arial" w:cs="Arial"/>
                 <w:b w:val="0"/>
-                <w:sz w:val="18"/>
+                <w:color w:val="000000"/>
+                <w:sz w:val="16"/>
               </w:rPr>
               <w:t>Normalized FY2032 FCFF</w:t>
             </w:r>
@@ -2732,16 +3430,19 @@
           <w:tcPr>
             <w:tcW w:type="dxa" w:w="2088"/>
             <w:vAlign w:val="center"/>
-            <w:shd w:fill="F6F8FA"/>
+            <w:shd w:fill="E5E5E5"/>
           </w:tcPr>
           <w:p>
             <w:pPr>
-              <w:spacing w:after="80" w:before="80"/>
+              <w:spacing w:after="40" w:before="40"/>
+              <w:jc w:val="left"/>
             </w:pPr>
             <w:r>
               <w:rPr>
+                <w:rFonts w:ascii="Arial" w:hAnsi="Arial" w:eastAsia="Arial" w:cs="Arial"/>
                 <w:b w:val="0"/>
-                <w:sz w:val="18"/>
+                <w:color w:val="000000"/>
+                <w:sz w:val="16"/>
               </w:rPr>
               <w:t>$368.2bn</w:t>
             </w:r>
@@ -2751,16 +3452,19 @@
           <w:tcPr>
             <w:tcW w:type="dxa" w:w="4032"/>
             <w:vAlign w:val="center"/>
-            <w:shd w:fill="F6F8FA"/>
+            <w:shd w:fill="E5E5E5"/>
           </w:tcPr>
           <w:p>
             <w:pPr>
-              <w:spacing w:after="80" w:before="80"/>
+              <w:spacing w:after="40" w:before="40"/>
+              <w:jc w:val="left"/>
             </w:pPr>
             <w:r>
               <w:rPr>
+                <w:rFonts w:ascii="Arial" w:hAnsi="Arial" w:eastAsia="Arial" w:cs="Arial"/>
                 <w:b w:val="0"/>
-                <w:sz w:val="18"/>
+                <w:color w:val="000000"/>
+                <w:sz w:val="16"/>
               </w:rPr>
               <w:t>55.16% of stable revenue</w:t>
             </w:r>
@@ -2779,12 +3483,15 @@
           </w:tcPr>
           <w:p>
             <w:pPr>
-              <w:spacing w:after="80" w:before="80"/>
+              <w:spacing w:after="40" w:before="40"/>
+              <w:jc w:val="left"/>
             </w:pPr>
             <w:r>
               <w:rPr>
+                <w:rFonts w:ascii="Arial" w:hAnsi="Arial" w:eastAsia="Arial" w:cs="Arial"/>
                 <w:b w:val="0"/>
-                <w:sz w:val="18"/>
+                <w:color w:val="000000"/>
+                <w:sz w:val="16"/>
               </w:rPr>
               <w:t>Exit EV to FY2031 EBITDA</w:t>
             </w:r>
@@ -2798,12 +3505,15 @@
           </w:tcPr>
           <w:p>
             <w:pPr>
-              <w:spacing w:after="80" w:before="80"/>
+              <w:spacing w:after="40" w:before="40"/>
+              <w:jc w:val="left"/>
             </w:pPr>
             <w:r>
               <w:rPr>
+                <w:rFonts w:ascii="Arial" w:hAnsi="Arial" w:eastAsia="Arial" w:cs="Arial"/>
                 <w:b w:val="0"/>
-                <w:sz w:val="18"/>
+                <w:color w:val="000000"/>
+                <w:sz w:val="16"/>
               </w:rPr>
               <w:t>13.55x</w:t>
             </w:r>
@@ -2817,12 +3527,15 @@
           </w:tcPr>
           <w:p>
             <w:pPr>
-              <w:spacing w:after="80" w:before="80"/>
+              <w:spacing w:after="40" w:before="40"/>
+              <w:jc w:val="left"/>
             </w:pPr>
             <w:r>
               <w:rPr>
+                <w:rFonts w:ascii="Arial" w:hAnsi="Arial" w:eastAsia="Arial" w:cs="Arial"/>
                 <w:b w:val="0"/>
-                <w:sz w:val="18"/>
+                <w:color w:val="000000"/>
+                <w:sz w:val="16"/>
               </w:rPr>
               <w:t>Requires independently supported peer and rate context</w:t>
             </w:r>
@@ -2837,16 +3550,19 @@
           <w:tcPr>
             <w:tcW w:type="dxa" w:w="3672"/>
             <w:vAlign w:val="center"/>
-            <w:shd w:fill="F6F8FA"/>
+            <w:shd w:fill="E5E5E5"/>
           </w:tcPr>
           <w:p>
             <w:pPr>
-              <w:spacing w:after="80" w:before="80"/>
+              <w:spacing w:after="40" w:before="40"/>
+              <w:jc w:val="left"/>
             </w:pPr>
             <w:r>
               <w:rPr>
+                <w:rFonts w:ascii="Arial" w:hAnsi="Arial" w:eastAsia="Arial" w:cs="Arial"/>
                 <w:b w:val="0"/>
-                <w:sz w:val="18"/>
+                <w:color w:val="000000"/>
+                <w:sz w:val="16"/>
               </w:rPr>
               <w:t>Shares with equity held constant</w:t>
             </w:r>
@@ -2856,16 +3572,19 @@
           <w:tcPr>
             <w:tcW w:type="dxa" w:w="2088"/>
             <w:vAlign w:val="center"/>
-            <w:shd w:fill="F6F8FA"/>
+            <w:shd w:fill="E5E5E5"/>
           </w:tcPr>
           <w:p>
             <w:pPr>
-              <w:spacing w:after="80" w:before="80"/>
+              <w:spacing w:after="40" w:before="40"/>
+              <w:jc w:val="left"/>
             </w:pPr>
             <w:r>
               <w:rPr>
+                <w:rFonts w:ascii="Arial" w:hAnsi="Arial" w:eastAsia="Arial" w:cs="Arial"/>
                 <w:b w:val="0"/>
-                <w:sz w:val="18"/>
+                <w:color w:val="000000"/>
+                <w:sz w:val="16"/>
               </w:rPr>
               <w:t>4,081.8m</w:t>
             </w:r>
@@ -2875,16 +3594,19 @@
           <w:tcPr>
             <w:tcW w:type="dxa" w:w="4032"/>
             <w:vAlign w:val="center"/>
-            <w:shd w:fill="F6F8FA"/>
+            <w:shd w:fill="E5E5E5"/>
           </w:tcPr>
           <w:p>
             <w:pPr>
-              <w:spacing w:after="80" w:before="80"/>
+              <w:spacing w:after="40" w:before="40"/>
+              <w:jc w:val="left"/>
             </w:pPr>
             <w:r>
               <w:rPr>
+                <w:rFonts w:ascii="Arial" w:hAnsi="Arial" w:eastAsia="Arial" w:cs="Arial"/>
                 <w:b w:val="0"/>
-                <w:sz w:val="18"/>
+                <w:color w:val="000000"/>
+                <w:sz w:val="16"/>
               </w:rPr>
               <w:t>Cost-free share removal is not an economic buyback</w:t>
             </w:r>
@@ -2892,92 +3614,196 @@
         </w:tc>
       </w:tr>
     </w:tbl>
-    <w:p/>
+    <w:p>
+      <w:pPr>
+        <w:jc w:val="left"/>
+      </w:pPr>
+    </w:p>
     <w:p>
       <w:pPr>
         <w:pStyle w:val="Heading2"/>
+        <w:jc w:val="left"/>
       </w:pPr>
       <w:r>
+        <w:rPr>
+          <w:rFonts w:ascii="Arial" w:hAnsi="Arial" w:eastAsia="Arial" w:cs="Arial"/>
+          <w:color w:val="000000"/>
+          <w:sz w:val="18"/>
+        </w:rPr>
         <w:t>ROIC ceiling</w:t>
       </w:r>
     </w:p>
     <w:p>
+      <w:pPr>
+        <w:jc w:val="left"/>
+      </w:pPr>
       <w:r>
+        <w:rPr>
+          <w:rFonts w:ascii="Arial" w:hAnsi="Arial" w:eastAsia="Arial" w:cs="Arial"/>
+          <w:color w:val="000000"/>
+          <w:sz w:val="18"/>
+        </w:rPr>
         <w:t>At a fixed stable margin and growth rate, higher ROIC reduces investment needed for growth. As ROIC tends to infinity, reinvestment tends to zero and FCFF approaches NOPAT. The market target under the base assumptions requires more cash than that ceiling. A negative algebraic ROIC is therefore not reported as a valid business solution.</w:t>
       </w:r>
     </w:p>
     <w:p>
       <w:pPr>
         <w:pStyle w:val="Heading2"/>
+        <w:jc w:val="left"/>
       </w:pPr>
       <w:r>
+        <w:rPr>
+          <w:rFonts w:ascii="Arial" w:hAnsi="Arial" w:eastAsia="Arial" w:cs="Arial"/>
+          <w:color w:val="000000"/>
+          <w:sz w:val="18"/>
+        </w:rPr>
         <w:t>Native sensitivity and case comparison</w:t>
       </w:r>
     </w:p>
     <w:p>
+      <w:pPr>
+        <w:jc w:val="left"/>
+      </w:pPr>
       <w:r>
+        <w:rPr>
+          <w:rFonts w:ascii="Arial" w:hAnsi="Arial" w:eastAsia="Arial" w:cs="Arial"/>
+          <w:color w:val="000000"/>
+          <w:sz w:val="18"/>
+        </w:rPr>
         <w:t>The DCF sheet contains native two-input Excel What-If tables. The WACC and stable-growth inputs are the actual cells used to price the primary DCF, on the same worksheet. The live case grid temporarily tests the same scenario selector and growth input. The diagonal gives each case at its own stable growth without duplicated forecasts or fixed case snapshots.</w:t>
       </w:r>
     </w:p>
     <w:p>
       <w:pPr>
         <w:pStyle w:val="Heading2"/>
+        <w:jc w:val="left"/>
       </w:pPr>
       <w:r>
+        <w:rPr>
+          <w:rFonts w:ascii="Arial" w:hAnsi="Arial" w:eastAsia="Arial" w:cs="Arial"/>
+          <w:color w:val="000000"/>
+          <w:sz w:val="18"/>
+        </w:rPr>
         <w:t>Ownership and exit multiple</w:t>
       </w:r>
     </w:p>
     <w:p>
+      <w:pPr>
+        <w:jc w:val="left"/>
+      </w:pPr>
       <w:r>
+        <w:rPr>
+          <w:rFonts w:ascii="Arial" w:hAnsi="Arial" w:eastAsia="Arial" w:cs="Arial"/>
+          <w:color w:val="000000"/>
+          <w:sz w:val="18"/>
+        </w:rPr>
         <w:t>Ownership compares point shares, the point count plus the award proxy and historical diluted EPS shares. A reverse share count is shown only as algebra; the funded buyback example deducts its cash cost. The exit multiple crosscheck uses an explicitly editable illustrative 12x assumption, with no invented comparable-company sample.</w:t>
       </w:r>
     </w:p>
     <w:p>
+      <w:pPr>
+        <w:jc w:val="left"/>
+      </w:pPr>
       <w:r>
+        <w:rPr>
+          <w:rFonts w:ascii="Arial" w:hAnsi="Arial" w:eastAsia="Arial" w:cs="Arial"/>
+          <w:color w:val="000000"/>
+          <w:sz w:val="18"/>
+        </w:rPr>
         <w:br w:type="page"/>
       </w:r>
     </w:p>
     <w:p>
       <w:pPr>
         <w:pStyle w:val="Heading1"/>
+        <w:jc w:val="center"/>
       </w:pPr>
       <w:r>
+        <w:rPr>
+          <w:rFonts w:ascii="Arial" w:hAnsi="Arial" w:eastAsia="Arial" w:cs="Arial"/>
+          <w:color w:val="000000"/>
+          <w:sz w:val="21"/>
+        </w:rPr>
         <w:t>Beta inference and conditional simulation</w:t>
       </w:r>
     </w:p>
     <w:p>
       <w:pPr>
         <w:pStyle w:val="Heading2"/>
+        <w:jc w:val="left"/>
       </w:pPr>
       <w:r>
+        <w:rPr>
+          <w:rFonts w:ascii="Arial" w:hAnsi="Arial" w:eastAsia="Arial" w:cs="Arial"/>
+          <w:color w:val="000000"/>
+          <w:sz w:val="18"/>
+        </w:rPr>
         <w:t>Five year market model</w:t>
       </w:r>
     </w:p>
     <w:p>
+      <w:pPr>
+        <w:jc w:val="left"/>
+      </w:pPr>
       <w:r>
+        <w:rPr>
+          <w:rFonts w:ascii="Arial" w:hAnsi="Arial" w:eastAsia="Arial" w:cs="Arial"/>
+          <w:color w:val="000000"/>
+          <w:sz w:val="18"/>
+        </w:rPr>
         <w:t>The regression has 1,255 daily return observations, ending 8 October 2026, for Microsoft against the SPY S&amp;P 500 proxy. OLS beta is 1.1278 and R squared is 0.472. HC3 beta standard error is 0.0396; the approximate 95% Student t confidence interval is 1.0501 to 1.2055.</w:t>
       </w:r>
     </w:p>
     <w:p>
+      <w:pPr>
+        <w:jc w:val="left"/>
+      </w:pPr>
       <w:r>
+        <w:rPr>
+          <w:rFonts w:ascii="Arial" w:hAnsi="Arial" w:eastAsia="Arial" w:cs="Arial"/>
+          <w:color w:val="000000"/>
+          <w:sz w:val="18"/>
+        </w:rPr>
         <w:t>HC3 uses squared residuals divided by one minus leverage squared in the covariance sandwich. It changes inference, not the fitted beta. Newey-West lag five beta standard error is 0.0502, compared with conventional OLS 0.0337. The workbook also shows a two-year daily beta and optional Blume adjustment. The intercept is a daily total-return market-model alpha, not a historical excess-return CAPM alpha.</w:t>
       </w:r>
     </w:p>
     <w:p>
       <w:pPr>
         <w:pStyle w:val="Heading2"/>
+        <w:jc w:val="left"/>
       </w:pPr>
       <w:r>
+        <w:rPr>
+          <w:rFonts w:ascii="Arial" w:hAnsi="Arial" w:eastAsia="Arial" w:cs="Arial"/>
+          <w:color w:val="000000"/>
+          <w:sz w:val="18"/>
+        </w:rPr>
         <w:t>Discount rate sources</w:t>
       </w:r>
     </w:p>
     <w:p>
+      <w:pPr>
+        <w:jc w:val="left"/>
+      </w:pPr>
       <w:r>
+        <w:rPr>
+          <w:rFonts w:ascii="Arial" w:hAnsi="Arial" w:eastAsia="Arial" w:cs="Arial"/>
+          <w:color w:val="000000"/>
+          <w:sz w:val="18"/>
+        </w:rPr>
         <w:t>The model uses the 8 October 10-year Treasury yield of 5.22%, explicitly dated 1 October Damodaran ERP of 4.20% and January AAA synthetic spread of 0.40%. Equity weights use cutoff price times point shares. Debt and finance lease liabilities are disclosure proxies. The debt shield uses an explicit 21% marginal tax assumption.</w:t>
       </w:r>
     </w:p>
     <w:p>
+      <w:pPr>
+        <w:jc w:val="left"/>
+      </w:pPr>
       <w:r>
+        <w:rPr>
+          <w:rFonts w:ascii="Arial" w:hAnsi="Arial" w:eastAsia="Arial" w:cs="Arial"/>
+          <w:color w:val="000000"/>
+          <w:sz w:val="18"/>
+        </w:rPr>
         <w:drawing>
           <wp:inline xmlns:a="http://schemas.openxmlformats.org/drawingml/2006/main" xmlns:pic="http://schemas.openxmlformats.org/drawingml/2006/picture">
             <wp:extent cx="6217920" cy="2664823"/>
@@ -2993,7 +3819,9 @@
                     <pic:cNvPicPr/>
                   </pic:nvPicPr>
                   <pic:blipFill>
-                    <a:blip r:embed="rId12"/>
+                    <a:blip r:embed="rId12">
+                      <a:grayscl/>
+                    </a:blip>
                     <a:stretch>
                       <a:fillRect/>
                     </a:stretch>
@@ -3015,110 +3843,235 @@
     <w:p>
       <w:pPr>
         <w:pStyle w:val="Caption"/>
+        <w:jc w:val="left"/>
       </w:pPr>
       <w:r>
+        <w:rPr>
+          <w:rFonts w:ascii="Arial" w:hAnsi="Arial" w:eastAsia="Arial" w:cs="Arial"/>
+          <w:color w:val="000000"/>
+          <w:sz w:val="16"/>
+        </w:rPr>
         <w:t>Independent triangular priors and fixed uniforms with seed 20261008</w:t>
       </w:r>
     </w:p>
     <w:p>
+      <w:pPr>
+        <w:jc w:val="left"/>
+      </w:pPr>
       <w:r>
+        <w:rPr>
+          <w:rFonts w:ascii="Arial" w:hAnsi="Arial" w:eastAsia="Arial" w:cs="Arial"/>
+          <w:color w:val="000000"/>
+          <w:sz w:val="18"/>
+        </w:rPr>
         <w:t>Under these subjective priors, the conditional median value is $283.92, with 5th and 95th percentiles $224.15 and $362.83. The simulation uses 1,000 identical frozen draws in both engines. Those percentiles describe the selected model assumptions, not empirically estimated market outcome probabilities.</w:t>
       </w:r>
     </w:p>
     <w:p>
+      <w:pPr>
+        <w:jc w:val="left"/>
+      </w:pPr>
       <w:r>
+        <w:rPr>
+          <w:rFonts w:ascii="Arial" w:hAnsi="Arial" w:eastAsia="Arial" w:cs="Arial"/>
+          <w:color w:val="000000"/>
+          <w:sz w:val="18"/>
+        </w:rPr>
         <w:t>The simulation replaces segment growth with uniform CAGR, changes operating and stable margins together, scales cash capex, and varies WACC and stable growth. D&amp;A, other ratios, bridge and stable ROIC remain fixed. Independent triangular ranges omit correlated shocks, model error and tail events; the mode preserves final revenue but changes the intervening path.</w:t>
       </w:r>
     </w:p>
     <w:p>
+      <w:pPr>
+        <w:jc w:val="left"/>
+      </w:pPr>
       <w:r>
+        <w:rPr>
+          <w:rFonts w:ascii="Arial" w:hAnsi="Arial" w:eastAsia="Arial" w:cs="Arial"/>
+          <w:color w:val="000000"/>
+          <w:sz w:val="18"/>
+        </w:rPr>
         <w:br w:type="page"/>
       </w:r>
     </w:p>
     <w:p>
       <w:pPr>
         <w:pStyle w:val="Heading1"/>
+        <w:jc w:val="center"/>
       </w:pPr>
       <w:r>
+        <w:rPr>
+          <w:rFonts w:ascii="Arial" w:hAnsi="Arial" w:eastAsia="Arial" w:cs="Arial"/>
+          <w:color w:val="000000"/>
+          <w:sz w:val="21"/>
+        </w:rPr>
         <w:t>Raw evidence and reproducible calculations</w:t>
       </w:r>
     </w:p>
     <w:p>
       <w:pPr>
         <w:pStyle w:val="Heading2"/>
+        <w:jc w:val="left"/>
       </w:pPr>
       <w:r>
+        <w:rPr>
+          <w:rFonts w:ascii="Arial" w:hAnsi="Arial" w:eastAsia="Arial" w:cs="Arial"/>
+          <w:color w:val="000000"/>
+          <w:sz w:val="18"/>
+        </w:rPr>
         <w:t>Sources and marked materials</w:t>
       </w:r>
     </w:p>
     <w:p>
+      <w:pPr>
+        <w:jc w:val="left"/>
+      </w:pPr>
       <w:r>
+        <w:rPr>
+          <w:rFonts w:ascii="Arial" w:hAnsi="Arial" w:eastAsia="Arial" w:cs="Arial"/>
+          <w:color w:val="000000"/>
+          <w:sz w:val="18"/>
+        </w:rPr>
         <w:t>The project includes full original annual report PDFs FY2017 to FY2026 and separate marked copies. The 402-record source crosswalk identifies selected input, fiscal year, report year, native PDF page, raw units, conversion and Excel destinations. All 344 reported records are highlighted; 51 unavailable note disclosures remain n.a. Seven normalized absence records are distinguished from explicitly reported zero values.</w:t>
       </w:r>
     </w:p>
     <w:p>
+      <w:pPr>
+        <w:jc w:val="left"/>
+      </w:pPr>
       <w:r>
+        <w:rPr>
+          <w:rFonts w:ascii="Arial" w:hAnsi="Arial" w:eastAsia="Arial" w:cs="Arial"/>
+          <w:color w:val="000000"/>
+          <w:sz w:val="18"/>
+        </w:rPr>
         <w:t>Annotations preserve native PDF text and page counts. Clicking a colored highlight shows its source ID and current DCF cell references. Bookmarks and margin stripes identify used pages. FY2017 is retained as an original archive report, while selected FY2017 observations come from later comparative reports. Income, balance, cash-flow, notes and segment inputs use the documented color legend.</w:t>
       </w:r>
     </w:p>
     <w:p>
+      <w:pPr>
+        <w:jc w:val="left"/>
+      </w:pPr>
       <w:r>
+        <w:rPr>
+          <w:rFonts w:ascii="Arial" w:hAnsi="Arial" w:eastAsia="Arial" w:cs="Arial"/>
+          <w:color w:val="000000"/>
+          <w:sz w:val="18"/>
+        </w:rPr>
         <w:t>Raw market materials include original HTML, JSON, CSV and XLSX responses, dated metadata and SHA-256 hashes. The Treasury and Yahoo datasets can contain later information in their full response; only observations at or before 8 October enter the processed inputs. The ERP monthly archive has an inconsistent final date serial, so the dated author homepage determines the period selection. Market_Source_Extracts.pdf is clearly identified as a generated review extract.</w:t>
       </w:r>
     </w:p>
     <w:p>
       <w:pPr>
         <w:pStyle w:val="Heading2"/>
+        <w:jc w:val="left"/>
       </w:pPr>
       <w:r>
+        <w:rPr>
+          <w:rFonts w:ascii="Arial" w:hAnsi="Arial" w:eastAsia="Arial" w:cs="Arial"/>
+          <w:color w:val="000000"/>
+          <w:sz w:val="18"/>
+        </w:rPr>
         <w:t>Two implementations</w:t>
       </w:r>
     </w:p>
     <w:p>
+      <w:pPr>
+        <w:jc w:val="left"/>
+      </w:pPr>
       <w:r>
+        <w:rPr>
+          <w:rFonts w:ascii="Arial" w:hAnsi="Arial" w:eastAsia="Arial" w:cs="Arial"/>
+          <w:color w:val="000000"/>
+          <w:sz w:val="18"/>
+        </w:rPr>
         <w:t>The workbook performs the live DCF, robust beta inference, reverse criteria and simulation with ordinary formulas and native data tables. Python Code contains the full plain-text Python program, preserving indentation and blank lines. The same program is available as src/valuation.py and uses NumPy and SciPy without requiring embedded Python in Excel.</w:t>
       </w:r>
     </w:p>
     <w:p>
+      <w:pPr>
+        <w:jc w:val="left"/>
+      </w:pPr>
       <w:r>
+        <w:rPr>
+          <w:rFonts w:ascii="Arial" w:hAnsi="Arial" w:eastAsia="Arial" w:cs="Arial"/>
+          <w:color w:val="000000"/>
+          <w:sz w:val="18"/>
+        </w:rPr>
         <w:t>For VSCode, keep the complete archive folder structure, install requirements.txt and run python src/valuation.py. To replay edited Excel drivers, run python src/valuation.py --excel deliverables/Microsoft_DCF_ReverseDCF_Model.xlsx. Mapped numeric assumptions are read directly from the XLSX; Python does not use formula caches to obtain calculated values.</w:t>
       </w:r>
     </w:p>
     <w:p>
       <w:pPr>
         <w:pStyle w:val="Heading2"/>
+        <w:jc w:val="left"/>
       </w:pPr>
       <w:r>
+        <w:rPr>
+          <w:rFonts w:ascii="Arial" w:hAnsi="Arial" w:eastAsia="Arial" w:cs="Arial"/>
+          <w:color w:val="000000"/>
+          <w:sz w:val="18"/>
+        </w:rPr>
         <w:t>Verification and use</w:t>
       </w:r>
     </w:p>
     <w:p>
+      <w:pPr>
+        <w:jc w:val="left"/>
+      </w:pPr>
       <w:r>
+        <w:rPr>
+          <w:rFonts w:ascii="Arial" w:hAnsi="Arial" w:eastAsia="Arial" w:cs="Arial"/>
+          <w:color w:val="000000"/>
+          <w:sz w:val="18"/>
+        </w:rPr>
         <w:t>The Audit sheet compares independently computed scenario values, OLS beta, HC3 and HAC inference, reverse valuation residuals and deterministic simulation results. Enterprise-to-equity and segment-sum identities are also checked. Frozen baseline comparisons intentionally change after editing inputs; rerun Python to verify the edited model.</w:t>
       </w:r>
     </w:p>
     <w:p>
+      <w:pPr>
+        <w:jc w:val="left"/>
+      </w:pPr>
       <w:r>
+        <w:rPr>
+          <w:rFonts w:ascii="Arial" w:hAnsi="Arial" w:eastAsia="Arial" w:cs="Arial"/>
+          <w:color w:val="000000"/>
+          <w:sz w:val="18"/>
+        </w:rPr>
         <w:t>Table rows are consistently 24 pt. Expanded observations use merged blocks of those rows. Native hover Notes explain inputs and formulas; charts use linked ranges. The workbook avoids TEXT-based narrative formulas. Calculation uses the XLSX international formula syntax. After editing in Excel, enable Automatic calculation including data tables and recalculate.</w:t>
       </w:r>
     </w:p>
     <w:p>
       <w:pPr>
         <w:pStyle w:val="Heading2"/>
+        <w:jc w:val="left"/>
       </w:pPr>
       <w:r>
+        <w:rPr>
+          <w:rFonts w:ascii="Arial" w:hAnsi="Arial" w:eastAsia="Arial" w:cs="Arial"/>
+          <w:color w:val="000000"/>
+          <w:sz w:val="18"/>
+        </w:rPr>
         <w:t>Primary references</w:t>
       </w:r>
     </w:p>
     <w:p>
+      <w:pPr>
+        <w:jc w:val="left"/>
+      </w:pPr>
       <w:r>
+        <w:rPr>
+          <w:rFonts w:ascii="Arial" w:hAnsi="Arial" w:eastAsia="Arial" w:cs="Arial"/>
+          <w:color w:val="000000"/>
+          <w:sz w:val="18"/>
+        </w:rPr>
         <w:t>Microsoft annual reports and SEC filing information in the per-cell crosswalk. Issuer price lookup microsoft.gcs-web.com. US Treasury daily par yield curve home.treasury.gov. Damodaran dated ERP and rating spread tables pages.stern.nyu.edu/~adamodar. HC3 method documentation statsmodels.org. Yahoo price responses are retained as the original downloaded market dataset.</w:t>
       </w:r>
     </w:p>
     <w:sectPr>
       <w:footerReference w:type="default" r:id="rId9"/>
-      <w:pgSz w:w="12240" w:h="15840"/>
-      <w:pgMar w:top="1008" w:right="1080" w:bottom="1008" w:left="1080" w:header="432" w:footer="432" w:gutter="0"/>
+      <w:headerReference w:type="default" r:id="rId13"/>
+      <w:pgSz w:w="11900" w:h="16840"/>
+      <w:pgMar w:top="576" w:right="504" w:bottom="576" w:left="504" w:header="288" w:footer="288" w:gutter="0"/>
       <w:cols w:space="720"/>
       <w:docGrid w:linePitch="360"/>
     </w:sectPr>
@@ -3131,10 +4084,12 @@
   <w:p>
     <w:pPr>
       <w:pStyle w:val="Footer"/>
-      <w:jc w:val="right"/>
+      <w:jc w:val="center"/>
     </w:pPr>
     <w:r>
       <w:rPr>
+        <w:rFonts w:ascii="Arial" w:hAnsi="Arial" w:eastAsia="Arial" w:cs="Arial"/>
+        <w:color w:val="000000"/>
         <w:sz w:val="16"/>
       </w:rPr>
       <w:t xml:space="preserve">Goran Brkich | Portfolio project 02 | </w:t>
@@ -3142,6 +4097,17 @@
     <w:fldSimple w:instr="PAGE"/>
   </w:p>
 </w:ftr>
+</file>
+
+<file path=word/header1.xml><?xml version="1.0" encoding="utf-8"?>
+<w:hdr xmlns:m="http://schemas.openxmlformats.org/officeDocument/2006/math" xmlns:mc="http://schemas.openxmlformats.org/markup-compatibility/2006" xmlns:mo="http://schemas.microsoft.com/office/mac/office/2008/main" xmlns:mv="urn:schemas-microsoft-com:mac:vml" xmlns:o="urn:schemas-microsoft-com:office:office" xmlns:r="http://schemas.openxmlformats.org/officeDocument/2006/relationships" xmlns:v="urn:schemas-microsoft-com:vml" xmlns:w10="urn:schemas-microsoft-com:office:word" xmlns:w14="http://schemas.microsoft.com/office/word/2010/wordml" xmlns:w="http://schemas.openxmlformats.org/wordprocessingml/2006/main" xmlns:wne="http://schemas.microsoft.com/office/word/2006/wordml" xmlns:wp14="http://schemas.microsoft.com/office/word/2010/wordprocessingDrawing" xmlns:wp="http://schemas.openxmlformats.org/drawingml/2006/wordprocessingDrawing" xmlns:wpc="http://schemas.microsoft.com/office/word/2010/wordprocessingCanvas" xmlns:wpg="http://schemas.microsoft.com/office/word/2010/wordprocessingGroup" xmlns:wpi="http://schemas.microsoft.com/office/word/2010/wordprocessingInk" xmlns:wps="http://schemas.microsoft.com/office/word/2010/wordprocessingShape" mc:Ignorable="w14 wp14">
+  <w:p>
+    <w:pPr>
+      <w:pStyle w:val="Header"/>
+      <w:jc w:val="left"/>
+    </w:pPr>
+  </w:p>
+</w:hdr>
 </file>
 
 <file path=word/numbering.xml><?xml version="1.0" encoding="utf-8"?>
@@ -3508,12 +4474,12 @@
     <w:qFormat/>
     <w:rsid w:val="00FC693F"/>
     <w:pPr>
-      <w:spacing w:line="264" w:lineRule="auto" w:after="160"/>
+      <w:spacing w:line="252" w:lineRule="auto" w:after="100" w:before="0"/>
     </w:pPr>
     <w:rPr>
       <w:rFonts w:ascii="Arial" w:hAnsi="Arial"/>
       <w:color w:val="000000"/>
-      <w:sz w:val="21"/>
+      <w:sz w:val="18"/>
     </w:rPr>
   </w:style>
   <w:style w:type="paragraph" w:styleId="Header">
@@ -3530,6 +4496,10 @@
       </w:tabs>
       <w:spacing w:after="0" w:line="240" w:lineRule="auto"/>
     </w:pPr>
+    <w:rPr>
+      <w:rFonts w:ascii="Arial" w:hAnsi="Arial"/>
+      <w:color w:val="000000"/>
+    </w:rPr>
   </w:style>
   <w:style w:type="character" w:customStyle="1" w:styleId="HeaderChar">
     <w:name w:val="Header Char"/>
@@ -3537,6 +4507,10 @@
     <w:link w:val="Header"/>
     <w:uiPriority w:val="99"/>
     <w:rsid w:val="00E618BF"/>
+    <w:rPr>
+      <w:rFonts w:ascii="Arial" w:hAnsi="Arial"/>
+      <w:color w:val="000000"/>
+    </w:rPr>
   </w:style>
   <w:style w:type="paragraph" w:styleId="Footer">
     <w:name w:val="footer"/>
@@ -3552,6 +4526,10 @@
       </w:tabs>
       <w:spacing w:after="0" w:line="240" w:lineRule="auto"/>
     </w:pPr>
+    <w:rPr>
+      <w:rFonts w:ascii="Arial" w:hAnsi="Arial"/>
+      <w:color w:val="000000"/>
+    </w:rPr>
   </w:style>
   <w:style w:type="character" w:customStyle="1" w:styleId="FooterChar">
     <w:name w:val="Footer Char"/>
@@ -3559,6 +4537,10 @@
     <w:link w:val="Footer"/>
     <w:uiPriority w:val="99"/>
     <w:rsid w:val="00E618BF"/>
+    <w:rPr>
+      <w:rFonts w:ascii="Arial" w:hAnsi="Arial"/>
+      <w:color w:val="000000"/>
+    </w:rPr>
   </w:style>
   <w:style w:type="paragraph" w:styleId="Heading1">
     <w:name w:val="heading 1"/>
@@ -3571,15 +4553,16 @@
     <w:pPr>
       <w:keepNext/>
       <w:keepLines/>
-      <w:spacing w:before="480" w:after="200"/>
+      <w:spacing w:before="120" w:after="120"/>
       <w:outlineLvl w:val="0"/>
     </w:pPr>
     <w:rPr>
       <w:rFonts w:asciiTheme="majorHAnsi" w:eastAsiaTheme="majorEastAsia" w:hAnsiTheme="majorHAnsi" w:cstheme="majorBidi" w:ascii="Arial" w:hAnsi="Arial"/>
       <w:b/>
       <w:bCs/>
+      <w:caps/>
       <w:color w:val="000000"/>
-      <w:sz w:val="34"/>
+      <w:sz w:val="21"/>
       <w:szCs w:val="28"/>
     </w:rPr>
   </w:style>
@@ -3595,15 +4578,16 @@
     <w:pPr>
       <w:keepNext/>
       <w:keepLines/>
-      <w:spacing w:before="200" w:after="0"/>
+      <w:spacing w:before="120" w:after="120"/>
       <w:outlineLvl w:val="1"/>
     </w:pPr>
     <w:rPr>
       <w:rFonts w:asciiTheme="majorHAnsi" w:eastAsiaTheme="majorEastAsia" w:hAnsiTheme="majorHAnsi" w:cstheme="majorBidi" w:ascii="Arial" w:hAnsi="Arial"/>
       <w:b/>
       <w:bCs/>
+      <w:caps/>
       <w:color w:val="000000"/>
-      <w:sz w:val="24"/>
+      <w:sz w:val="18"/>
       <w:szCs w:val="26"/>
     </w:rPr>
   </w:style>
@@ -3619,14 +4603,16 @@
     <w:pPr>
       <w:keepNext/>
       <w:keepLines/>
-      <w:spacing w:before="200" w:after="0"/>
+      <w:spacing w:before="120" w:after="120"/>
       <w:outlineLvl w:val="2"/>
     </w:pPr>
     <w:rPr>
-      <w:rFonts w:asciiTheme="majorHAnsi" w:eastAsiaTheme="majorEastAsia" w:hAnsiTheme="majorHAnsi" w:cstheme="majorBidi"/>
+      <w:rFonts w:asciiTheme="majorHAnsi" w:eastAsiaTheme="majorEastAsia" w:hAnsiTheme="majorHAnsi" w:cstheme="majorBidi" w:ascii="Arial" w:hAnsi="Arial"/>
       <w:b/>
       <w:bCs/>
-      <w:color w:val="4F81BD" w:themeColor="accent1"/>
+      <w:caps/>
+      <w:color w:val="000000"/>
+      <w:sz w:val="18"/>
     </w:rPr>
   </w:style>
   <w:style w:type="paragraph" w:styleId="Heading4">
@@ -3646,12 +4632,12 @@
       <w:outlineLvl w:val="3"/>
     </w:pPr>
     <w:rPr>
-      <w:rFonts w:asciiTheme="majorHAnsi" w:eastAsiaTheme="majorEastAsia" w:hAnsiTheme="majorHAnsi" w:cstheme="majorBidi"/>
+      <w:rFonts w:asciiTheme="majorHAnsi" w:eastAsiaTheme="majorEastAsia" w:hAnsiTheme="majorHAnsi" w:cstheme="majorBidi" w:ascii="Arial" w:hAnsi="Arial"/>
       <w:b/>
       <w:bCs/>
       <w:i/>
       <w:iCs/>
-      <w:color w:val="4F81BD" w:themeColor="accent1"/>
+      <w:color w:val="000000"/>
     </w:rPr>
   </w:style>
   <w:style w:type="paragraph" w:styleId="Heading5">
@@ -3671,8 +4657,8 @@
       <w:outlineLvl w:val="4"/>
     </w:pPr>
     <w:rPr>
-      <w:rFonts w:asciiTheme="majorHAnsi" w:eastAsiaTheme="majorEastAsia" w:hAnsiTheme="majorHAnsi" w:cstheme="majorBidi"/>
-      <w:color w:val="243F60" w:themeColor="accent1" w:themeShade="7F"/>
+      <w:rFonts w:asciiTheme="majorHAnsi" w:eastAsiaTheme="majorEastAsia" w:hAnsiTheme="majorHAnsi" w:cstheme="majorBidi" w:ascii="Arial" w:hAnsi="Arial"/>
+      <w:color w:val="000000"/>
     </w:rPr>
   </w:style>
   <w:style w:type="paragraph" w:styleId="Heading6">
@@ -3692,10 +4678,10 @@
       <w:outlineLvl w:val="5"/>
     </w:pPr>
     <w:rPr>
-      <w:rFonts w:asciiTheme="majorHAnsi" w:eastAsiaTheme="majorEastAsia" w:hAnsiTheme="majorHAnsi" w:cstheme="majorBidi"/>
+      <w:rFonts w:asciiTheme="majorHAnsi" w:eastAsiaTheme="majorEastAsia" w:hAnsiTheme="majorHAnsi" w:cstheme="majorBidi" w:ascii="Arial" w:hAnsi="Arial"/>
       <w:i/>
       <w:iCs/>
-      <w:color w:val="243F60" w:themeColor="accent1" w:themeShade="7F"/>
+      <w:color w:val="000000"/>
     </w:rPr>
   </w:style>
   <w:style w:type="paragraph" w:styleId="Heading7">
@@ -3715,10 +4701,10 @@
       <w:outlineLvl w:val="6"/>
     </w:pPr>
     <w:rPr>
-      <w:rFonts w:asciiTheme="majorHAnsi" w:eastAsiaTheme="majorEastAsia" w:hAnsiTheme="majorHAnsi" w:cstheme="majorBidi"/>
+      <w:rFonts w:asciiTheme="majorHAnsi" w:eastAsiaTheme="majorEastAsia" w:hAnsiTheme="majorHAnsi" w:cstheme="majorBidi" w:ascii="Arial" w:hAnsi="Arial"/>
       <w:i/>
       <w:iCs/>
-      <w:color w:val="404040" w:themeColor="text1" w:themeTint="BF"/>
+      <w:color w:val="000000"/>
     </w:rPr>
   </w:style>
   <w:style w:type="paragraph" w:styleId="Heading8">
@@ -3738,8 +4724,8 @@
       <w:outlineLvl w:val="7"/>
     </w:pPr>
     <w:rPr>
-      <w:rFonts w:asciiTheme="majorHAnsi" w:eastAsiaTheme="majorEastAsia" w:hAnsiTheme="majorHAnsi" w:cstheme="majorBidi"/>
-      <w:color w:val="4F81BD" w:themeColor="accent1"/>
+      <w:rFonts w:asciiTheme="majorHAnsi" w:eastAsiaTheme="majorEastAsia" w:hAnsiTheme="majorHAnsi" w:cstheme="majorBidi" w:ascii="Arial" w:hAnsi="Arial"/>
+      <w:color w:val="000000"/>
       <w:sz w:val="20"/>
       <w:szCs w:val="20"/>
     </w:rPr>
@@ -3761,10 +4747,10 @@
       <w:outlineLvl w:val="8"/>
     </w:pPr>
     <w:rPr>
-      <w:rFonts w:asciiTheme="majorHAnsi" w:eastAsiaTheme="majorEastAsia" w:hAnsiTheme="majorHAnsi" w:cstheme="majorBidi"/>
+      <w:rFonts w:asciiTheme="majorHAnsi" w:eastAsiaTheme="majorEastAsia" w:hAnsiTheme="majorHAnsi" w:cstheme="majorBidi" w:ascii="Arial" w:hAnsi="Arial"/>
       <w:i/>
       <w:iCs/>
-      <w:color w:val="404040" w:themeColor="text1" w:themeTint="BF"/>
+      <w:color w:val="000000"/>
       <w:sz w:val="20"/>
       <w:szCs w:val="20"/>
     </w:rPr>
@@ -3774,6 +4760,10 @@
     <w:uiPriority w:val="1"/>
     <w:semiHidden/>
     <w:unhideWhenUsed/>
+    <w:rPr>
+      <w:rFonts w:ascii="Arial" w:hAnsi="Arial"/>
+      <w:color w:val="000000"/>
+    </w:rPr>
   </w:style>
   <w:style w:type="table" w:default="1" w:styleId="TableNormal">
     <w:name w:val="Normal Table"/>
@@ -3804,6 +4794,10 @@
     <w:pPr>
       <w:spacing w:after="0" w:line="240" w:lineRule="auto"/>
     </w:pPr>
+    <w:rPr>
+      <w:rFonts w:ascii="Arial" w:hAnsi="Arial"/>
+      <w:color w:val="000000"/>
+    </w:rPr>
   </w:style>
   <w:style w:type="character" w:customStyle="1" w:styleId="Heading1Char">
     <w:name w:val="Heading 1 Char"/>
@@ -3812,10 +4806,10 @@
     <w:uiPriority w:val="9"/>
     <w:rsid w:val="00FC693F"/>
     <w:rPr>
-      <w:rFonts w:asciiTheme="majorHAnsi" w:eastAsiaTheme="majorEastAsia" w:hAnsiTheme="majorHAnsi" w:cstheme="majorBidi"/>
+      <w:rFonts w:asciiTheme="majorHAnsi" w:eastAsiaTheme="majorEastAsia" w:hAnsiTheme="majorHAnsi" w:cstheme="majorBidi" w:ascii="Arial" w:hAnsi="Arial"/>
       <w:b/>
       <w:bCs/>
-      <w:color w:val="365F91" w:themeColor="accent1" w:themeShade="BF"/>
+      <w:color w:val="000000"/>
       <w:sz w:val="28"/>
       <w:szCs w:val="28"/>
     </w:rPr>
@@ -3827,10 +4821,10 @@
     <w:uiPriority w:val="9"/>
     <w:rsid w:val="00FC693F"/>
     <w:rPr>
-      <w:rFonts w:asciiTheme="majorHAnsi" w:eastAsiaTheme="majorEastAsia" w:hAnsiTheme="majorHAnsi" w:cstheme="majorBidi"/>
+      <w:rFonts w:asciiTheme="majorHAnsi" w:eastAsiaTheme="majorEastAsia" w:hAnsiTheme="majorHAnsi" w:cstheme="majorBidi" w:ascii="Arial" w:hAnsi="Arial"/>
       <w:b/>
       <w:bCs/>
-      <w:color w:val="4F81BD" w:themeColor="accent1"/>
+      <w:color w:val="000000"/>
       <w:sz w:val="26"/>
       <w:szCs w:val="26"/>
     </w:rPr>
@@ -3842,10 +4836,10 @@
     <w:uiPriority w:val="9"/>
     <w:rsid w:val="00FC693F"/>
     <w:rPr>
-      <w:rFonts w:asciiTheme="majorHAnsi" w:eastAsiaTheme="majorEastAsia" w:hAnsiTheme="majorHAnsi" w:cstheme="majorBidi"/>
+      <w:rFonts w:asciiTheme="majorHAnsi" w:eastAsiaTheme="majorEastAsia" w:hAnsiTheme="majorHAnsi" w:cstheme="majorBidi" w:ascii="Arial" w:hAnsi="Arial"/>
       <w:b/>
       <w:bCs/>
-      <w:color w:val="4F81BD" w:themeColor="accent1"/>
+      <w:color w:val="000000"/>
     </w:rPr>
   </w:style>
   <w:style w:type="paragraph" w:styleId="Title">
@@ -3857,16 +4851,18 @@
     <w:qFormat/>
     <w:rsid w:val="00FC693F"/>
     <w:pPr>
-      <w:spacing w:after="300" w:line="240" w:lineRule="auto"/>
+      <w:keepNext w:val="0"/>
+      <w:spacing w:after="120" w:line="240" w:lineRule="auto" w:before="0"/>
       <w:contextualSpacing/>
     </w:pPr>
     <w:rPr>
       <w:rFonts w:asciiTheme="majorHAnsi" w:eastAsiaTheme="majorEastAsia" w:hAnsiTheme="majorHAnsi" w:cstheme="majorBidi" w:ascii="Arial" w:hAnsi="Arial"/>
       <w:b/>
+      <w:caps/>
       <w:color w:val="000000"/>
       <w:spacing w:val="5"/>
       <w:kern w:val="28"/>
-      <w:sz w:val="46"/>
+      <w:sz w:val="32"/>
       <w:szCs w:val="52"/>
     </w:rPr>
   </w:style>
@@ -3877,8 +4873,8 @@
     <w:uiPriority w:val="10"/>
     <w:rsid w:val="00FC693F"/>
     <w:rPr>
-      <w:rFonts w:asciiTheme="majorHAnsi" w:eastAsiaTheme="majorEastAsia" w:hAnsiTheme="majorHAnsi" w:cstheme="majorBidi"/>
-      <w:color w:val="17365D" w:themeColor="text2" w:themeShade="BF"/>
+      <w:rFonts w:asciiTheme="majorHAnsi" w:eastAsiaTheme="majorEastAsia" w:hAnsiTheme="majorHAnsi" w:cstheme="majorBidi" w:ascii="Arial" w:hAnsi="Arial"/>
+      <w:color w:val="000000"/>
       <w:spacing w:val="5"/>
       <w:kern w:val="28"/>
       <w:sz w:val="52"/>
@@ -3894,10 +4890,28 @@
     <w:qFormat/>
     <w:rsid w:val="00FC693F"/>
     <w:pPr>
+      <w:keepNext w:val="0"/>
       <w:numPr>
         <w:ilvl w:val="1"/>
       </w:numPr>
+      <w:spacing w:before="0" w:after="120"/>
     </w:pPr>
+    <w:rPr>
+      <w:rFonts w:asciiTheme="majorHAnsi" w:eastAsiaTheme="majorEastAsia" w:hAnsiTheme="majorHAnsi" w:cstheme="majorBidi" w:ascii="Arial" w:hAnsi="Arial"/>
+      <w:i/>
+      <w:iCs/>
+      <w:color w:val="000000"/>
+      <w:spacing w:val="15"/>
+      <w:sz w:val="18"/>
+      <w:szCs w:val="24"/>
+    </w:rPr>
+  </w:style>
+  <w:style w:type="character" w:customStyle="1" w:styleId="SubtitleChar">
+    <w:name w:val="Subtitle Char"/>
+    <w:basedOn w:val="DefaultParagraphFont"/>
+    <w:link w:val="Subtitle"/>
+    <w:uiPriority w:val="11"/>
+    <w:rsid w:val="00FC693F"/>
     <w:rPr>
       <w:rFonts w:asciiTheme="majorHAnsi" w:eastAsiaTheme="majorEastAsia" w:hAnsiTheme="majorHAnsi" w:cstheme="majorBidi" w:ascii="Arial" w:hAnsi="Arial"/>
       <w:i/>
@@ -3908,22 +4922,6 @@
       <w:szCs w:val="24"/>
     </w:rPr>
   </w:style>
-  <w:style w:type="character" w:customStyle="1" w:styleId="SubtitleChar">
-    <w:name w:val="Subtitle Char"/>
-    <w:basedOn w:val="DefaultParagraphFont"/>
-    <w:link w:val="Subtitle"/>
-    <w:uiPriority w:val="11"/>
-    <w:rsid w:val="00FC693F"/>
-    <w:rPr>
-      <w:rFonts w:asciiTheme="majorHAnsi" w:eastAsiaTheme="majorEastAsia" w:hAnsiTheme="majorHAnsi" w:cstheme="majorBidi"/>
-      <w:i/>
-      <w:iCs/>
-      <w:color w:val="4F81BD" w:themeColor="accent1"/>
-      <w:spacing w:val="15"/>
-      <w:sz w:val="24"/>
-      <w:szCs w:val="24"/>
-    </w:rPr>
-  </w:style>
   <w:style w:type="paragraph" w:styleId="ListParagraph">
     <w:name w:val="List Paragraph"/>
     <w:basedOn w:val="Normal"/>
@@ -3931,9 +4929,15 @@
     <w:qFormat/>
     <w:rsid w:val="00FC693F"/>
     <w:pPr>
+      <w:spacing w:line="252" w:lineRule="auto" w:after="100" w:before="0"/>
       <w:ind w:left="720"/>
       <w:contextualSpacing/>
     </w:pPr>
+    <w:rPr>
+      <w:rFonts w:ascii="Arial" w:hAnsi="Arial"/>
+      <w:color w:val="000000"/>
+      <w:sz w:val="18"/>
+    </w:rPr>
   </w:style>
   <w:style w:type="paragraph" w:styleId="BodyText">
     <w:name w:val="Body Text"/>
@@ -3943,8 +4947,13 @@
     <w:unhideWhenUsed/>
     <w:rsid w:val="00AA1D8D"/>
     <w:pPr>
-      <w:spacing w:after="120"/>
+      <w:spacing w:after="100" w:line="252" w:lineRule="auto" w:before="0"/>
     </w:pPr>
+    <w:rPr>
+      <w:rFonts w:ascii="Arial" w:hAnsi="Arial"/>
+      <w:color w:val="000000"/>
+      <w:sz w:val="18"/>
+    </w:rPr>
   </w:style>
   <w:style w:type="character" w:customStyle="1" w:styleId="BodyTextChar">
     <w:name w:val="Body Text Char"/>
@@ -3952,6 +4961,10 @@
     <w:link w:val="BodyText"/>
     <w:uiPriority w:val="99"/>
     <w:rsid w:val="00AA1D8D"/>
+    <w:rPr>
+      <w:rFonts w:ascii="Arial" w:hAnsi="Arial"/>
+      <w:color w:val="000000"/>
+    </w:rPr>
   </w:style>
   <w:style w:type="paragraph" w:styleId="BodyText2">
     <w:name w:val="Body Text 2"/>
@@ -3963,6 +4976,10 @@
     <w:pPr>
       <w:spacing w:after="120" w:line="480" w:lineRule="auto"/>
     </w:pPr>
+    <w:rPr>
+      <w:rFonts w:ascii="Arial" w:hAnsi="Arial"/>
+      <w:color w:val="000000"/>
+    </w:rPr>
   </w:style>
   <w:style w:type="character" w:customStyle="1" w:styleId="BodyText2Char">
     <w:name w:val="Body Text 2 Char"/>
@@ -3970,6 +4987,10 @@
     <w:link w:val="BodyText2"/>
     <w:uiPriority w:val="99"/>
     <w:rsid w:val="00AA1D8D"/>
+    <w:rPr>
+      <w:rFonts w:ascii="Arial" w:hAnsi="Arial"/>
+      <w:color w:val="000000"/>
+    </w:rPr>
   </w:style>
   <w:style w:type="paragraph" w:styleId="BodyText3">
     <w:name w:val="Body Text 3"/>
@@ -3982,6 +5003,8 @@
       <w:spacing w:after="120"/>
     </w:pPr>
     <w:rPr>
+      <w:rFonts w:ascii="Arial" w:hAnsi="Arial"/>
+      <w:color w:val="000000"/>
       <w:sz w:val="16"/>
       <w:szCs w:val="16"/>
     </w:rPr>
@@ -3993,6 +5016,8 @@
     <w:uiPriority w:val="99"/>
     <w:rsid w:val="00AA1D8D"/>
     <w:rPr>
+      <w:rFonts w:ascii="Arial" w:hAnsi="Arial"/>
+      <w:color w:val="000000"/>
       <w:sz w:val="16"/>
       <w:szCs w:val="16"/>
     </w:rPr>
@@ -4007,6 +5032,10 @@
       <w:ind w:left="360" w:hanging="360"/>
       <w:contextualSpacing/>
     </w:pPr>
+    <w:rPr>
+      <w:rFonts w:ascii="Arial" w:hAnsi="Arial"/>
+      <w:color w:val="000000"/>
+    </w:rPr>
   </w:style>
   <w:style w:type="paragraph" w:styleId="List2">
     <w:name w:val="List 2"/>
@@ -4018,6 +5047,10 @@
       <w:ind w:left="720" w:hanging="360"/>
       <w:contextualSpacing/>
     </w:pPr>
+    <w:rPr>
+      <w:rFonts w:ascii="Arial" w:hAnsi="Arial"/>
+      <w:color w:val="000000"/>
+    </w:rPr>
   </w:style>
   <w:style w:type="paragraph" w:styleId="List3">
     <w:name w:val="List 3"/>
@@ -4029,6 +5062,10 @@
       <w:ind w:left="1080" w:hanging="360"/>
       <w:contextualSpacing/>
     </w:pPr>
+    <w:rPr>
+      <w:rFonts w:ascii="Arial" w:hAnsi="Arial"/>
+      <w:color w:val="000000"/>
+    </w:rPr>
   </w:style>
   <w:style w:type="paragraph" w:styleId="ListBullet">
     <w:name w:val="List Bullet"/>
@@ -4042,6 +5079,10 @@
       </w:numPr>
       <w:contextualSpacing/>
     </w:pPr>
+    <w:rPr>
+      <w:rFonts w:ascii="Arial" w:hAnsi="Arial"/>
+      <w:color w:val="000000"/>
+    </w:rPr>
   </w:style>
   <w:style w:type="paragraph" w:styleId="ListBullet2">
     <w:name w:val="List Bullet 2"/>
@@ -4055,6 +5096,10 @@
       </w:numPr>
       <w:contextualSpacing/>
     </w:pPr>
+    <w:rPr>
+      <w:rFonts w:ascii="Arial" w:hAnsi="Arial"/>
+      <w:color w:val="000000"/>
+    </w:rPr>
   </w:style>
   <w:style w:type="paragraph" w:styleId="ListBullet3">
     <w:name w:val="List Bullet 3"/>
@@ -4068,6 +5113,10 @@
       </w:numPr>
       <w:contextualSpacing/>
     </w:pPr>
+    <w:rPr>
+      <w:rFonts w:ascii="Arial" w:hAnsi="Arial"/>
+      <w:color w:val="000000"/>
+    </w:rPr>
   </w:style>
   <w:style w:type="paragraph" w:styleId="ListNumber">
     <w:name w:val="List Number"/>
@@ -4081,6 +5130,10 @@
       </w:numPr>
       <w:contextualSpacing/>
     </w:pPr>
+    <w:rPr>
+      <w:rFonts w:ascii="Arial" w:hAnsi="Arial"/>
+      <w:color w:val="000000"/>
+    </w:rPr>
   </w:style>
   <w:style w:type="paragraph" w:styleId="ListNumber2">
     <w:name w:val="List Number 2"/>
@@ -4094,6 +5147,10 @@
       </w:numPr>
       <w:contextualSpacing/>
     </w:pPr>
+    <w:rPr>
+      <w:rFonts w:ascii="Arial" w:hAnsi="Arial"/>
+      <w:color w:val="000000"/>
+    </w:rPr>
   </w:style>
   <w:style w:type="paragraph" w:styleId="ListNumber3">
     <w:name w:val="List Number 3"/>
@@ -4107,6 +5164,10 @@
       </w:numPr>
       <w:contextualSpacing/>
     </w:pPr>
+    <w:rPr>
+      <w:rFonts w:ascii="Arial" w:hAnsi="Arial"/>
+      <w:color w:val="000000"/>
+    </w:rPr>
   </w:style>
   <w:style w:type="paragraph" w:styleId="ListContinue">
     <w:name w:val="List Continue"/>
@@ -4119,6 +5180,10 @@
       <w:ind w:left="360"/>
       <w:contextualSpacing/>
     </w:pPr>
+    <w:rPr>
+      <w:rFonts w:ascii="Arial" w:hAnsi="Arial"/>
+      <w:color w:val="000000"/>
+    </w:rPr>
   </w:style>
   <w:style w:type="paragraph" w:styleId="ListContinue2">
     <w:name w:val="List Continue 2"/>
@@ -4131,6 +5196,10 @@
       <w:ind w:left="720"/>
       <w:contextualSpacing/>
     </w:pPr>
+    <w:rPr>
+      <w:rFonts w:ascii="Arial" w:hAnsi="Arial"/>
+      <w:color w:val="000000"/>
+    </w:rPr>
   </w:style>
   <w:style w:type="paragraph" w:styleId="ListContinue3">
     <w:name w:val="List Continue 3"/>
@@ -4143,6 +5212,10 @@
       <w:ind w:left="1080"/>
       <w:contextualSpacing/>
     </w:pPr>
+    <w:rPr>
+      <w:rFonts w:ascii="Arial" w:hAnsi="Arial"/>
+      <w:color w:val="000000"/>
+    </w:rPr>
   </w:style>
   <w:style w:type="paragraph" w:styleId="MacroText">
     <w:name w:val="macro"/>
@@ -4162,7 +5235,8 @@
       </w:tabs>
     </w:pPr>
     <w:rPr>
-      <w:rFonts w:ascii="Courier" w:hAnsi="Courier"/>
+      <w:rFonts w:ascii="Arial" w:hAnsi="Arial"/>
+      <w:color w:val="000000"/>
       <w:sz w:val="20"/>
       <w:szCs w:val="20"/>
     </w:rPr>
@@ -4174,7 +5248,8 @@
     <w:uiPriority w:val="99"/>
     <w:rsid w:val="0029639D"/>
     <w:rPr>
-      <w:rFonts w:ascii="Courier" w:hAnsi="Courier"/>
+      <w:rFonts w:ascii="Arial" w:hAnsi="Arial"/>
+      <w:color w:val="000000"/>
       <w:sz w:val="20"/>
       <w:szCs w:val="20"/>
     </w:rPr>
@@ -4188,9 +5263,10 @@
     <w:qFormat/>
     <w:rsid w:val="00FC693F"/>
     <w:rPr>
+      <w:rFonts w:ascii="Arial" w:hAnsi="Arial"/>
       <w:i/>
       <w:iCs/>
-      <w:color w:val="000000" w:themeColor="text1"/>
+      <w:color w:val="000000"/>
     </w:rPr>
   </w:style>
   <w:style w:type="character" w:customStyle="1" w:styleId="QuoteChar">
@@ -4200,9 +5276,10 @@
     <w:uiPriority w:val="29"/>
     <w:rsid w:val="00FC693F"/>
     <w:rPr>
+      <w:rFonts w:ascii="Arial" w:hAnsi="Arial"/>
       <w:i/>
       <w:iCs/>
-      <w:color w:val="000000" w:themeColor="text1"/>
+      <w:color w:val="000000"/>
     </w:rPr>
   </w:style>
   <w:style w:type="character" w:customStyle="1" w:styleId="Heading4Char">
@@ -4213,12 +5290,12 @@
     <w:semiHidden/>
     <w:rsid w:val="00FC693F"/>
     <w:rPr>
-      <w:rFonts w:asciiTheme="majorHAnsi" w:eastAsiaTheme="majorEastAsia" w:hAnsiTheme="majorHAnsi" w:cstheme="majorBidi"/>
+      <w:rFonts w:asciiTheme="majorHAnsi" w:eastAsiaTheme="majorEastAsia" w:hAnsiTheme="majorHAnsi" w:cstheme="majorBidi" w:ascii="Arial" w:hAnsi="Arial"/>
       <w:b/>
       <w:bCs/>
       <w:i/>
       <w:iCs/>
-      <w:color w:val="4F81BD" w:themeColor="accent1"/>
+      <w:color w:val="000000"/>
     </w:rPr>
   </w:style>
   <w:style w:type="character" w:customStyle="1" w:styleId="Heading5Char">
@@ -4229,8 +5306,8 @@
     <w:semiHidden/>
     <w:rsid w:val="00FC693F"/>
     <w:rPr>
-      <w:rFonts w:asciiTheme="majorHAnsi" w:eastAsiaTheme="majorEastAsia" w:hAnsiTheme="majorHAnsi" w:cstheme="majorBidi"/>
-      <w:color w:val="243F60" w:themeColor="accent1" w:themeShade="7F"/>
+      <w:rFonts w:asciiTheme="majorHAnsi" w:eastAsiaTheme="majorEastAsia" w:hAnsiTheme="majorHAnsi" w:cstheme="majorBidi" w:ascii="Arial" w:hAnsi="Arial"/>
+      <w:color w:val="000000"/>
     </w:rPr>
   </w:style>
   <w:style w:type="character" w:customStyle="1" w:styleId="Heading6Char">
@@ -4241,10 +5318,10 @@
     <w:semiHidden/>
     <w:rsid w:val="00FC693F"/>
     <w:rPr>
-      <w:rFonts w:asciiTheme="majorHAnsi" w:eastAsiaTheme="majorEastAsia" w:hAnsiTheme="majorHAnsi" w:cstheme="majorBidi"/>
+      <w:rFonts w:asciiTheme="majorHAnsi" w:eastAsiaTheme="majorEastAsia" w:hAnsiTheme="majorHAnsi" w:cstheme="majorBidi" w:ascii="Arial" w:hAnsi="Arial"/>
       <w:i/>
       <w:iCs/>
-      <w:color w:val="243F60" w:themeColor="accent1" w:themeShade="7F"/>
+      <w:color w:val="000000"/>
     </w:rPr>
   </w:style>
   <w:style w:type="character" w:customStyle="1" w:styleId="Heading7Char">
@@ -4255,10 +5332,10 @@
     <w:semiHidden/>
     <w:rsid w:val="00FC693F"/>
     <w:rPr>
-      <w:rFonts w:asciiTheme="majorHAnsi" w:eastAsiaTheme="majorEastAsia" w:hAnsiTheme="majorHAnsi" w:cstheme="majorBidi"/>
+      <w:rFonts w:asciiTheme="majorHAnsi" w:eastAsiaTheme="majorEastAsia" w:hAnsiTheme="majorHAnsi" w:cstheme="majorBidi" w:ascii="Arial" w:hAnsi="Arial"/>
       <w:i/>
       <w:iCs/>
-      <w:color w:val="404040" w:themeColor="text1" w:themeTint="BF"/>
+      <w:color w:val="000000"/>
     </w:rPr>
   </w:style>
   <w:style w:type="character" w:customStyle="1" w:styleId="Heading8Char">
@@ -4269,8 +5346,8 @@
     <w:semiHidden/>
     <w:rsid w:val="00FC693F"/>
     <w:rPr>
-      <w:rFonts w:asciiTheme="majorHAnsi" w:eastAsiaTheme="majorEastAsia" w:hAnsiTheme="majorHAnsi" w:cstheme="majorBidi"/>
-      <w:color w:val="4F81BD" w:themeColor="accent1"/>
+      <w:rFonts w:asciiTheme="majorHAnsi" w:eastAsiaTheme="majorEastAsia" w:hAnsiTheme="majorHAnsi" w:cstheme="majorBidi" w:ascii="Arial" w:hAnsi="Arial"/>
+      <w:color w:val="000000"/>
       <w:sz w:val="20"/>
       <w:szCs w:val="20"/>
     </w:rPr>
@@ -4283,10 +5360,10 @@
     <w:semiHidden/>
     <w:rsid w:val="00FC693F"/>
     <w:rPr>
-      <w:rFonts w:asciiTheme="majorHAnsi" w:eastAsiaTheme="majorEastAsia" w:hAnsiTheme="majorHAnsi" w:cstheme="majorBidi"/>
+      <w:rFonts w:asciiTheme="majorHAnsi" w:eastAsiaTheme="majorEastAsia" w:hAnsiTheme="majorHAnsi" w:cstheme="majorBidi" w:ascii="Arial" w:hAnsi="Arial"/>
       <w:i/>
       <w:iCs/>
-      <w:color w:val="404040" w:themeColor="text1" w:themeTint="BF"/>
+      <w:color w:val="000000"/>
       <w:sz w:val="20"/>
       <w:szCs w:val="20"/>
     </w:rPr>
@@ -4301,7 +5378,8 @@
     <w:qFormat/>
     <w:rsid w:val="00FC693F"/>
     <w:pPr>
-      <w:spacing w:line="240" w:lineRule="auto"/>
+      <w:keepNext w:val="0"/>
+      <w:spacing w:line="240" w:lineRule="auto" w:before="0" w:after="120"/>
     </w:pPr>
     <w:rPr>
       <w:rFonts w:ascii="Arial" w:hAnsi="Arial"/>
@@ -4309,7 +5387,7 @@
       <w:bCs/>
       <w:i/>
       <w:color w:val="000000"/>
-      <w:sz w:val="17"/>
+      <w:sz w:val="16"/>
       <w:szCs w:val="18"/>
     </w:rPr>
   </w:style>
@@ -4320,8 +5398,10 @@
     <w:qFormat/>
     <w:rsid w:val="00FC693F"/>
     <w:rPr>
+      <w:rFonts w:ascii="Arial" w:hAnsi="Arial"/>
       <w:b/>
       <w:bCs/>
+      <w:color w:val="000000"/>
     </w:rPr>
   </w:style>
   <w:style w:type="character" w:styleId="Emphasis">
@@ -4331,8 +5411,10 @@
     <w:qFormat/>
     <w:rsid w:val="00FC693F"/>
     <w:rPr>
+      <w:rFonts w:ascii="Arial" w:hAnsi="Arial"/>
       <w:i/>
       <w:iCs/>
+      <w:color w:val="000000"/>
     </w:rPr>
   </w:style>
   <w:style w:type="paragraph" w:styleId="IntenseQuote">
@@ -4348,11 +5430,12 @@
       <w:ind w:left="936" w:right="936"/>
     </w:pPr>
     <w:rPr>
+      <w:rFonts w:ascii="Arial" w:hAnsi="Arial"/>
       <w:b/>
       <w:bCs/>
       <w:i/>
       <w:iCs/>
-      <w:color w:val="4F81BD" w:themeColor="accent1"/>
+      <w:color w:val="000000"/>
     </w:rPr>
   </w:style>
   <w:style w:type="character" w:customStyle="1" w:styleId="IntenseQuoteChar">
@@ -4362,11 +5445,12 @@
     <w:uiPriority w:val="30"/>
     <w:rsid w:val="00FC693F"/>
     <w:rPr>
+      <w:rFonts w:ascii="Arial" w:hAnsi="Arial"/>
       <w:b/>
       <w:bCs/>
       <w:i/>
       <w:iCs/>
-      <w:color w:val="4F81BD" w:themeColor="accent1"/>
+      <w:color w:val="000000"/>
     </w:rPr>
   </w:style>
   <w:style w:type="character" w:styleId="SubtleEmphasis">
@@ -4376,9 +5460,10 @@
     <w:qFormat/>
     <w:rsid w:val="00FC693F"/>
     <w:rPr>
+      <w:rFonts w:ascii="Arial" w:hAnsi="Arial"/>
       <w:i/>
       <w:iCs/>
-      <w:color w:val="808080" w:themeColor="text1" w:themeTint="7F"/>
+      <w:color w:val="000000"/>
     </w:rPr>
   </w:style>
   <w:style w:type="character" w:styleId="IntenseEmphasis">
@@ -4388,11 +5473,12 @@
     <w:qFormat/>
     <w:rsid w:val="00FC693F"/>
     <w:rPr>
+      <w:rFonts w:ascii="Arial" w:hAnsi="Arial"/>
       <w:b/>
       <w:bCs/>
       <w:i/>
       <w:iCs/>
-      <w:color w:val="4F81BD" w:themeColor="accent1"/>
+      <w:color w:val="000000"/>
     </w:rPr>
   </w:style>
   <w:style w:type="character" w:styleId="SubtleReference">
@@ -4402,8 +5488,9 @@
     <w:qFormat/>
     <w:rsid w:val="00FC693F"/>
     <w:rPr>
+      <w:rFonts w:ascii="Arial" w:hAnsi="Arial"/>
       <w:smallCaps/>
-      <w:color w:val="C0504D" w:themeColor="accent2"/>
+      <w:color w:val="000000"/>
       <w:u w:val="single"/>
     </w:rPr>
   </w:style>
@@ -4414,10 +5501,11 @@
     <w:qFormat/>
     <w:rsid w:val="00FC693F"/>
     <w:rPr>
+      <w:rFonts w:ascii="Arial" w:hAnsi="Arial"/>
       <w:b/>
       <w:bCs/>
       <w:smallCaps/>
-      <w:color w:val="C0504D" w:themeColor="accent2"/>
+      <w:color w:val="000000"/>
       <w:spacing w:val="5"/>
       <w:u w:val="single"/>
     </w:rPr>
@@ -4429,9 +5517,11 @@
     <w:qFormat/>
     <w:rsid w:val="00FC693F"/>
     <w:rPr>
+      <w:rFonts w:ascii="Arial" w:hAnsi="Arial"/>
       <w:b/>
       <w:bCs/>
       <w:smallCaps/>
+      <w:color w:val="000000"/>
       <w:spacing w:val="5"/>
     </w:rPr>
   </w:style>
@@ -4447,6 +5537,10 @@
     <w:pPr>
       <w:outlineLvl w:val="9"/>
     </w:pPr>
+    <w:rPr>
+      <w:rFonts w:ascii="Arial" w:hAnsi="Arial"/>
+      <w:color w:val="000000"/>
+    </w:rPr>
   </w:style>
   <w:style w:type="table" w:styleId="TableGrid">
     <w:name w:val="Table Grid"/>

</xml_diff>